<commit_message>
Modificações na Documentação TCC
</commit_message>
<xml_diff>
--- a/tcc/TCC.docx
+++ b/tcc/TCC.docx
@@ -4415,6 +4415,13 @@
           <w:color w:val="000000" w:themeColor="text1"/>
         </w:rPr>
       </w:pPr>
+      <w:r>
+        <w:rPr>
+          <w:rFonts w:ascii="Times New Roman" w:hAnsi="Times New Roman" w:cs="Times New Roman"/>
+          <w:color w:val="000000" w:themeColor="text1"/>
+        </w:rPr>
+        <w:t xml:space="preserve"> </w:t>
+      </w:r>
       <w:r>
         <w:rPr>
           <w:rFonts w:ascii="Times New Roman" w:hAnsi="Times New Roman" w:cs="Times New Roman"/>

</xml_diff>

<commit_message>
Alterando TCC e Documentação
</commit_message>
<xml_diff>
--- a/tcc/TCC.docx
+++ b/tcc/TCC.docx
@@ -1,6 +1,6 @@
 
 <file path=word/document.xml><?xml version="1.0" encoding="utf-8"?>
-<w:document xmlns:wpc="http://schemas.microsoft.com/office/word/2010/wordprocessingCanvas" xmlns:cx="http://schemas.microsoft.com/office/drawing/2014/chartex" xmlns:cx1="http://schemas.microsoft.com/office/drawing/2015/9/8/chartex" xmlns:cx2="http://schemas.microsoft.com/office/drawing/2015/10/21/chartex" xmlns:cx3="http://schemas.microsoft.com/office/drawing/2016/5/9/chartex" xmlns:cx4="http://schemas.microsoft.com/office/drawing/2016/5/10/chartex" xmlns:cx5="http://schemas.microsoft.com/office/drawing/2016/5/11/chartex" xmlns:cx6="http://schemas.microsoft.com/office/drawing/2016/5/12/chartex" xmlns:cx7="http://schemas.microsoft.com/office/drawing/2016/5/13/chartex" xmlns:cx8="http://schemas.microsoft.com/office/drawing/2016/5/14/chartex" xmlns:mc="http://schemas.openxmlformats.org/markup-compatibility/2006" xmlns:aink="http://schemas.microsoft.com/office/drawing/2016/ink" xmlns:am3d="http://schemas.microsoft.com/office/drawing/2017/model3d" xmlns:o="urn:schemas-microsoft-com:office:office" xmlns:oel="http://schemas.microsoft.com/office/2019/extlst" xmlns:r="http://schemas.openxmlformats.org/officeDocument/2006/relationships" xmlns:m="http://schemas.openxmlformats.org/officeDocument/2006/math" xmlns:v="urn:schemas-microsoft-com:vml" xmlns:wp14="http://schemas.microsoft.com/office/word/2010/wordprocessingDrawing" xmlns:wp="http://schemas.openxmlformats.org/drawingml/2006/wordprocessingDrawing" xmlns:w10="urn:schemas-microsoft-com:office:word" xmlns:w="http://schemas.openxmlformats.org/wordprocessingml/2006/main" xmlns:w14="http://schemas.microsoft.com/office/word/2010/wordml" xmlns:w15="http://schemas.microsoft.com/office/word/2012/wordml" xmlns:w16cex="http://schemas.microsoft.com/office/word/2018/wordml/cex" xmlns:w16cid="http://schemas.microsoft.com/office/word/2016/wordml/cid" xmlns:w16="http://schemas.microsoft.com/office/word/2018/wordml" xmlns:w16du="http://schemas.microsoft.com/office/word/2023/wordml/word16du" xmlns:w16sdtdh="http://schemas.microsoft.com/office/word/2020/wordml/sdtdatahash" xmlns:w16sdtfl="http://schemas.microsoft.com/office/word/2024/wordml/sdtformatlock" xmlns:w16se="http://schemas.microsoft.com/office/word/2015/wordml/symex" xmlns:wpg="http://schemas.microsoft.com/office/word/2010/wordprocessingGroup" xmlns:wpi="http://schemas.microsoft.com/office/word/2010/wordprocessingInk" xmlns:wne="http://schemas.microsoft.com/office/word/2006/wordml" xmlns:wps="http://schemas.microsoft.com/office/word/2010/wordprocessingShape" mc:Ignorable="w14 w15 w16se w16cid w16 w16cex w16sdtdh w16sdtfl w16du wp14">
+<w:document xmlns:wpc="http://schemas.microsoft.com/office/word/2010/wordprocessingCanvas" xmlns:cx="http://schemas.microsoft.com/office/drawing/2014/chartex" xmlns:cx1="http://schemas.microsoft.com/office/drawing/2015/9/8/chartex" xmlns:cx2="http://schemas.microsoft.com/office/drawing/2015/10/21/chartex" xmlns:cx3="http://schemas.microsoft.com/office/drawing/2016/5/9/chartex" xmlns:cx4="http://schemas.microsoft.com/office/drawing/2016/5/10/chartex" xmlns:cx5="http://schemas.microsoft.com/office/drawing/2016/5/11/chartex" xmlns:cx6="http://schemas.microsoft.com/office/drawing/2016/5/12/chartex" xmlns:cx7="http://schemas.microsoft.com/office/drawing/2016/5/13/chartex" xmlns:cx8="http://schemas.microsoft.com/office/drawing/2016/5/14/chartex" xmlns:mc="http://schemas.openxmlformats.org/markup-compatibility/2006" xmlns:aink="http://schemas.microsoft.com/office/drawing/2016/ink" xmlns:am3d="http://schemas.microsoft.com/office/drawing/2017/model3d" xmlns:o="urn:schemas-microsoft-com:office:office" xmlns:r="http://schemas.openxmlformats.org/officeDocument/2006/relationships" xmlns:m="http://schemas.openxmlformats.org/officeDocument/2006/math" xmlns:v="urn:schemas-microsoft-com:vml" xmlns:wp14="http://schemas.microsoft.com/office/word/2010/wordprocessingDrawing" xmlns:wp="http://schemas.openxmlformats.org/drawingml/2006/wordprocessingDrawing" xmlns:w10="urn:schemas-microsoft-com:office:word" xmlns:w="http://schemas.openxmlformats.org/wordprocessingml/2006/main" xmlns:w14="http://schemas.microsoft.com/office/word/2010/wordml" xmlns:w15="http://schemas.microsoft.com/office/word/2012/wordml" xmlns:w16cex="http://schemas.microsoft.com/office/word/2018/wordml/cex" xmlns:w16cid="http://schemas.microsoft.com/office/word/2016/wordml/cid" xmlns:w16="http://schemas.microsoft.com/office/word/2018/wordml" xmlns:w16sdtdh="http://schemas.microsoft.com/office/word/2020/wordml/sdtdatahash" xmlns:w16se="http://schemas.microsoft.com/office/word/2015/wordml/symex" xmlns:wpg="http://schemas.microsoft.com/office/word/2010/wordprocessingGroup" xmlns:wpi="http://schemas.microsoft.com/office/word/2010/wordprocessingInk" xmlns:wne="http://schemas.microsoft.com/office/word/2006/wordml" xmlns:wps="http://schemas.microsoft.com/office/word/2010/wordprocessingShape" mc:Ignorable="w14 w15 w16se w16cid w16 w16cex w16sdtdh wp14">
   <w:body>
     <w:p>
       <w:pPr>
@@ -295,7 +295,6 @@
     <w:p>
       <w:pPr>
         <w:pStyle w:val="Corpodetexto"/>
-        <w:jc w:val="both"/>
         <w:rPr>
           <w:rFonts w:ascii="Times New Roman" w:eastAsiaTheme="majorEastAsia" w:hAnsi="Times New Roman" w:cs="Times New Roman"/>
           <w:b/>
@@ -421,7 +420,7 @@
           <w:bCs/>
           <w:color w:val="000000" w:themeColor="text1"/>
         </w:rPr>
-        <w:t>2025</w:t>
+        <w:t>2026</w:t>
       </w:r>
     </w:p>
     <w:p>
@@ -831,7 +830,7 @@
           <w:rFonts w:ascii="Times New Roman" w:hAnsi="Times New Roman" w:cs="Times New Roman"/>
           <w:color w:val="000000" w:themeColor="text1"/>
         </w:rPr>
-        <w:t>2025</w:t>
+        <w:t>2026</w:t>
       </w:r>
     </w:p>
     <w:p>
@@ -966,7 +965,7 @@
               <w:rPr>
                 <w:webHidden/>
               </w:rPr>
-              <w:t>10</w:t>
+              <w:t>5</w:t>
             </w:r>
             <w:r>
               <w:rPr>
@@ -1029,7 +1028,7 @@
               <w:rPr>
                 <w:webHidden/>
               </w:rPr>
-              <w:t>11</w:t>
+              <w:t>6</w:t>
             </w:r>
             <w:r>
               <w:rPr>
@@ -1092,7 +1091,7 @@
               <w:rPr>
                 <w:webHidden/>
               </w:rPr>
-              <w:t>12</w:t>
+              <w:t>7</w:t>
             </w:r>
             <w:r>
               <w:rPr>
@@ -1182,7 +1181,7 @@
                 <w:noProof/>
                 <w:webHidden/>
               </w:rPr>
-              <w:t>12</w:t>
+              <w:t>7</w:t>
             </w:r>
             <w:r>
               <w:rPr>
@@ -1256,7 +1255,7 @@
                 <w:noProof/>
                 <w:webHidden/>
               </w:rPr>
-              <w:t>12</w:t>
+              <w:t>7</w:t>
             </w:r>
             <w:r>
               <w:rPr>
@@ -1347,7 +1346,7 @@
                 <w:noProof/>
                 <w:webHidden/>
               </w:rPr>
-              <w:t>12</w:t>
+              <w:t>7</w:t>
             </w:r>
             <w:r>
               <w:rPr>
@@ -1421,7 +1420,7 @@
                 <w:noProof/>
                 <w:webHidden/>
               </w:rPr>
-              <w:t>12</w:t>
+              <w:t>7</w:t>
             </w:r>
             <w:r>
               <w:rPr>
@@ -1485,7 +1484,7 @@
               <w:rPr>
                 <w:webHidden/>
               </w:rPr>
-              <w:t>13</w:t>
+              <w:t>8</w:t>
             </w:r>
             <w:r>
               <w:rPr>
@@ -1574,7 +1573,7 @@
                 <w:noProof/>
                 <w:webHidden/>
               </w:rPr>
-              <w:t>13</w:t>
+              <w:t>8</w:t>
             </w:r>
             <w:r>
               <w:rPr>
@@ -1647,7 +1646,7 @@
                 <w:noProof/>
                 <w:webHidden/>
               </w:rPr>
-              <w:t>13</w:t>
+              <w:t>8</w:t>
             </w:r>
             <w:r>
               <w:rPr>
@@ -1729,7 +1728,7 @@
                 <w:noProof/>
                 <w:webHidden/>
               </w:rPr>
-              <w:t>13</w:t>
+              <w:t>8</w:t>
             </w:r>
             <w:r>
               <w:rPr>
@@ -1803,7 +1802,7 @@
                 <w:noProof/>
                 <w:webHidden/>
               </w:rPr>
-              <w:t>14</w:t>
+              <w:t>9</w:t>
             </w:r>
             <w:r>
               <w:rPr>
@@ -1877,7 +1876,7 @@
                 <w:noProof/>
                 <w:webHidden/>
               </w:rPr>
-              <w:t>14</w:t>
+              <w:t>9</w:t>
             </w:r>
             <w:r>
               <w:rPr>
@@ -1951,7 +1950,7 @@
                 <w:noProof/>
                 <w:webHidden/>
               </w:rPr>
-              <w:t>14</w:t>
+              <w:t>9</w:t>
             </w:r>
             <w:r>
               <w:rPr>
@@ -2015,7 +2014,7 @@
               <w:rPr>
                 <w:webHidden/>
               </w:rPr>
-              <w:t>15</w:t>
+              <w:t>10</w:t>
             </w:r>
             <w:r>
               <w:rPr>
@@ -2088,7 +2087,7 @@
                 <w:noProof/>
                 <w:webHidden/>
               </w:rPr>
-              <w:t>15</w:t>
+              <w:t>10</w:t>
             </w:r>
             <w:r>
               <w:rPr>
@@ -2162,7 +2161,7 @@
                 <w:noProof/>
                 <w:webHidden/>
               </w:rPr>
-              <w:t>15</w:t>
+              <w:t>10</w:t>
             </w:r>
             <w:r>
               <w:rPr>
@@ -2236,7 +2235,7 @@
                 <w:noProof/>
                 <w:webHidden/>
               </w:rPr>
-              <w:t>15</w:t>
+              <w:t>10</w:t>
             </w:r>
             <w:r>
               <w:rPr>
@@ -2294,7 +2293,7 @@
                 <w:rFonts w:ascii="Times New Roman" w:hAnsi="Times New Roman" w:cs="Times New Roman"/>
                 <w:noProof/>
               </w:rPr>
-              <w:t>: O código foi gerenciado via Git/GitHub.</w:t>
+              <w:t>.</w:t>
             </w:r>
             <w:r>
               <w:rPr>
@@ -2335,7 +2334,7 @@
                 <w:noProof/>
                 <w:webHidden/>
               </w:rPr>
-              <w:t>15</w:t>
+              <w:t>10</w:t>
             </w:r>
             <w:r>
               <w:rPr>
@@ -2389,14 +2388,6 @@
             </w:r>
             <w:r>
               <w:rPr>
-                <w:rStyle w:val="Hyperlink"/>
-                <w:rFonts w:ascii="Times New Roman" w:hAnsi="Times New Roman" w:cs="Times New Roman"/>
-                <w:noProof/>
-              </w:rPr>
-              <w:t>: Utilizou-se o GitHub Actions para automatizar rotinas de build e testes a cada novo commit.</w:t>
-            </w:r>
-            <w:r>
-              <w:rPr>
                 <w:noProof/>
                 <w:webHidden/>
               </w:rPr>
@@ -2434,7 +2425,7 @@
                 <w:noProof/>
                 <w:webHidden/>
               </w:rPr>
-              <w:t>15</w:t>
+              <w:t>10</w:t>
             </w:r>
             <w:r>
               <w:rPr>
@@ -2475,7 +2466,7 @@
                 <w:rFonts w:ascii="Times New Roman" w:hAnsi="Times New Roman" w:cs="Times New Roman"/>
                 <w:noProof/>
               </w:rPr>
-              <w:t>: A implantação (deploy) foi realizada na plataforma Vercel, permitindo a disponibilização imediata das novas funcionalidades em ambiente de produção.</w:t>
+              <w:t>.</w:t>
             </w:r>
             <w:r>
               <w:rPr>
@@ -2516,7 +2507,7 @@
                 <w:noProof/>
                 <w:webHidden/>
               </w:rPr>
-              <w:t>15</w:t>
+              <w:t>10</w:t>
             </w:r>
             <w:r>
               <w:rPr>
@@ -2557,7 +2548,7 @@
                 <w:rFonts w:ascii="Times New Roman" w:hAnsi="Times New Roman" w:cs="Times New Roman"/>
                 <w:noProof/>
               </w:rPr>
-              <w:t xml:space="preserve"> Para assegurar a robustez da aplicação, foram aplicadas diferentes camadas de verificação:</w:t>
+              <w:t>:</w:t>
             </w:r>
             <w:r>
               <w:rPr>
@@ -2598,7 +2589,7 @@
                 <w:noProof/>
                 <w:webHidden/>
               </w:rPr>
-              <w:t>15</w:t>
+              <w:t>10</w:t>
             </w:r>
             <w:r>
               <w:rPr>
@@ -2639,7 +2630,7 @@
                 <w:rFonts w:ascii="Times New Roman" w:hAnsi="Times New Roman" w:cs="Times New Roman"/>
                 <w:noProof/>
               </w:rPr>
-              <w:t>: Para validar a lógica de componentes isolados do sistema.</w:t>
+              <w:t>.</w:t>
             </w:r>
             <w:r>
               <w:rPr>
@@ -2680,7 +2671,7 @@
                 <w:noProof/>
                 <w:webHidden/>
               </w:rPr>
-              <w:t>15</w:t>
+              <w:t>10</w:t>
             </w:r>
             <w:r>
               <w:rPr>
@@ -2717,14 +2708,6 @@
             </w:r>
             <w:r>
               <w:rPr>
-                <w:rStyle w:val="Hyperlink"/>
-                <w:rFonts w:ascii="Times New Roman" w:hAnsi="Times New Roman" w:cs="Times New Roman"/>
-                <w:noProof/>
-              </w:rPr>
-              <w:t>: Para garantir que os módulos do sistema funcionem corretamente quando combinados.</w:t>
-            </w:r>
-            <w:r>
-              <w:rPr>
                 <w:noProof/>
                 <w:webHidden/>
               </w:rPr>
@@ -2762,7 +2745,7 @@
                 <w:noProof/>
                 <w:webHidden/>
               </w:rPr>
-              <w:t>15</w:t>
+              <w:t>10</w:t>
             </w:r>
             <w:r>
               <w:rPr>
@@ -2836,7 +2819,7 @@
                 <w:noProof/>
                 <w:webHidden/>
               </w:rPr>
-              <w:t>16</w:t>
+              <w:t>12</w:t>
             </w:r>
             <w:r>
               <w:rPr>
@@ -2910,14 +2893,7 @@
                 <w:noProof/>
                 <w:webHidden/>
               </w:rPr>
-              <w:t>1</w:t>
-            </w:r>
-            <w:r>
-              <w:rPr>
-                <w:noProof/>
-                <w:webHidden/>
-              </w:rPr>
-              <w:t>6</w:t>
+              <w:t>12</w:t>
             </w:r>
             <w:r>
               <w:rPr>
@@ -2981,7 +2957,7 @@
               <w:rPr>
                 <w:webHidden/>
               </w:rPr>
-              <w:t>17</w:t>
+              <w:t>14</w:t>
             </w:r>
             <w:r>
               <w:rPr>
@@ -3054,7 +3030,7 @@
                 <w:noProof/>
                 <w:webHidden/>
               </w:rPr>
-              <w:t>18</w:t>
+              <w:t>14</w:t>
             </w:r>
             <w:r>
               <w:rPr>
@@ -3128,7 +3104,7 @@
                 <w:noProof/>
                 <w:webHidden/>
               </w:rPr>
-              <w:t>18</w:t>
+              <w:t>14</w:t>
             </w:r>
             <w:r>
               <w:rPr>
@@ -3202,7 +3178,7 @@
                 <w:noProof/>
                 <w:webHidden/>
               </w:rPr>
-              <w:t>19</w:t>
+              <w:t>15</w:t>
             </w:r>
             <w:r>
               <w:rPr>
@@ -3276,7 +3252,7 @@
                 <w:noProof/>
                 <w:webHidden/>
               </w:rPr>
-              <w:t>19</w:t>
+              <w:t>15</w:t>
             </w:r>
             <w:r>
               <w:rPr>
@@ -3350,7 +3326,7 @@
                 <w:noProof/>
                 <w:webHidden/>
               </w:rPr>
-              <w:t>20</w:t>
+              <w:t>16</w:t>
             </w:r>
             <w:r>
               <w:rPr>
@@ -3414,7 +3390,7 @@
               <w:rPr>
                 <w:webHidden/>
               </w:rPr>
-              <w:t>21</w:t>
+              <w:t>17</w:t>
             </w:r>
             <w:r>
               <w:rPr>
@@ -3487,7 +3463,7 @@
                 <w:noProof/>
                 <w:webHidden/>
               </w:rPr>
-              <w:t>21</w:t>
+              <w:t>17</w:t>
             </w:r>
             <w:r>
               <w:rPr>
@@ -3561,7 +3537,7 @@
                 <w:noProof/>
                 <w:webHidden/>
               </w:rPr>
-              <w:t>21</w:t>
+              <w:t>17</w:t>
             </w:r>
             <w:r>
               <w:rPr>
@@ -3635,7 +3611,7 @@
                 <w:noProof/>
                 <w:webHidden/>
               </w:rPr>
-              <w:t>21</w:t>
+              <w:t>17</w:t>
             </w:r>
             <w:r>
               <w:rPr>
@@ -3709,7 +3685,7 @@
                 <w:noProof/>
                 <w:webHidden/>
               </w:rPr>
-              <w:t>21</w:t>
+              <w:t>17</w:t>
             </w:r>
             <w:r>
               <w:rPr>
@@ -3783,7 +3759,7 @@
                 <w:noProof/>
                 <w:webHidden/>
               </w:rPr>
-              <w:t>22</w:t>
+              <w:t>18</w:t>
             </w:r>
             <w:r>
               <w:rPr>
@@ -3857,7 +3833,7 @@
                 <w:noProof/>
                 <w:webHidden/>
               </w:rPr>
-              <w:t>22</w:t>
+              <w:t>18</w:t>
             </w:r>
             <w:r>
               <w:rPr>
@@ -3931,7 +3907,7 @@
                 <w:noProof/>
                 <w:webHidden/>
               </w:rPr>
-              <w:t>22</w:t>
+              <w:t>18</w:t>
             </w:r>
             <w:r>
               <w:rPr>
@@ -3995,7 +3971,7 @@
               <w:rPr>
                 <w:webHidden/>
               </w:rPr>
-              <w:t>23</w:t>
+              <w:t>19</w:t>
             </w:r>
             <w:r>
               <w:rPr>
@@ -4027,15 +4003,7 @@
                 <w:b/>
                 <w:noProof/>
               </w:rPr>
-              <w:t>6.1 Limitações e Trabalhos Futuros:</w:t>
-            </w:r>
-            <w:r>
-              <w:rPr>
-                <w:rStyle w:val="Hyperlink"/>
-                <w:rFonts w:ascii="Times New Roman" w:hAnsi="Times New Roman" w:cs="Times New Roman"/>
-                <w:noProof/>
-              </w:rPr>
-              <w:t xml:space="preserve"> Como limitação do estudo, destaca-se que a validação da ferramenta ocorreu em ambiente controlado e simulado. A implantação em larga escala em uma instituição de ensino real poderia revelar novos desafios de usabilidade e infraestrutura não mapeados nesta fase.</w:t>
+              <w:t>6.1 Limitações e Trabalhos Futuros</w:t>
             </w:r>
             <w:r>
               <w:rPr>
@@ -4076,7 +4044,7 @@
                 <w:noProof/>
                 <w:webHidden/>
               </w:rPr>
-              <w:t>23</w:t>
+              <w:t>19</w:t>
             </w:r>
             <w:r>
               <w:rPr>
@@ -4140,7 +4108,7 @@
               <w:rPr>
                 <w:webHidden/>
               </w:rPr>
-              <w:t>24</w:t>
+              <w:t>20</w:t>
             </w:r>
             <w:r>
               <w:rPr>
@@ -4203,7 +4171,7 @@
               <w:rPr>
                 <w:webHidden/>
               </w:rPr>
-              <w:t>25</w:t>
+              <w:t>21</w:t>
             </w:r>
             <w:r>
               <w:rPr>
@@ -4266,7 +4234,7 @@
               <w:rPr>
                 <w:webHidden/>
               </w:rPr>
-              <w:t>27</w:t>
+              <w:t>23</w:t>
             </w:r>
             <w:r>
               <w:rPr>
@@ -5461,7 +5429,23 @@
           <w:rFonts w:ascii="Times New Roman" w:hAnsi="Times New Roman" w:cs="Times New Roman"/>
           <w:color w:val="000000" w:themeColor="text1"/>
         </w:rPr>
-        <w:t xml:space="preserve"> Security (RLS), compliance </w:t>
+        <w:t xml:space="preserve"> Security (RLS), </w:t>
+      </w:r>
+      <w:proofErr w:type="spellStart"/>
+      <w:r>
+        <w:rPr>
+          <w:rFonts w:ascii="Times New Roman" w:hAnsi="Times New Roman" w:cs="Times New Roman"/>
+          <w:color w:val="000000" w:themeColor="text1"/>
+        </w:rPr>
+        <w:t>compliance</w:t>
+      </w:r>
+      <w:proofErr w:type="spellEnd"/>
+      <w:r>
+        <w:rPr>
+          <w:rFonts w:ascii="Times New Roman" w:hAnsi="Times New Roman" w:cs="Times New Roman"/>
+          <w:color w:val="000000" w:themeColor="text1"/>
+        </w:rPr>
+        <w:t xml:space="preserve"> </w:t>
       </w:r>
       <w:proofErr w:type="spellStart"/>
       <w:r>
@@ -5733,7 +5717,23 @@
           <w:rFonts w:ascii="Times New Roman" w:hAnsi="Times New Roman" w:cs="Times New Roman"/>
           <w:color w:val="000000" w:themeColor="text1"/>
         </w:rPr>
-        <w:t xml:space="preserve">, promoting </w:t>
+        <w:t xml:space="preserve">, </w:t>
+      </w:r>
+      <w:proofErr w:type="spellStart"/>
+      <w:r>
+        <w:rPr>
+          <w:rFonts w:ascii="Times New Roman" w:hAnsi="Times New Roman" w:cs="Times New Roman"/>
+          <w:color w:val="000000" w:themeColor="text1"/>
+        </w:rPr>
+        <w:t>promoting</w:t>
+      </w:r>
+      <w:proofErr w:type="spellEnd"/>
+      <w:r>
+        <w:rPr>
+          <w:rFonts w:ascii="Times New Roman" w:hAnsi="Times New Roman" w:cs="Times New Roman"/>
+          <w:color w:val="000000" w:themeColor="text1"/>
+        </w:rPr>
+        <w:t xml:space="preserve"> </w:t>
       </w:r>
       <w:proofErr w:type="spellStart"/>
       <w:r>
@@ -6587,14 +6587,22 @@
         </w:rPr>
         <w:t xml:space="preserve">O projeto possui relevância social, ao promover a inclusão escolar através da tecnologia, e relevância técnica, pela aplicação prática de conceitos de engenharia de software, segurança da informação e desenvolvimento </w:t>
       </w:r>
-      <w:proofErr w:type="spellStart"/>
       <w:r>
         <w:rPr>
           <w:rFonts w:ascii="Times New Roman" w:hAnsi="Times New Roman" w:cs="Times New Roman"/>
           <w:i/>
           <w:iCs/>
         </w:rPr>
-        <w:t>full-stack</w:t>
+        <w:t>full-</w:t>
+      </w:r>
+      <w:proofErr w:type="spellStart"/>
+      <w:r>
+        <w:rPr>
+          <w:rFonts w:ascii="Times New Roman" w:hAnsi="Times New Roman" w:cs="Times New Roman"/>
+          <w:i/>
+          <w:iCs/>
+        </w:rPr>
+        <w:t>stack</w:t>
       </w:r>
       <w:proofErr w:type="spellEnd"/>
       <w:r>
@@ -8287,6 +8295,672 @@
     <w:p>
       <w:pPr>
         <w:pStyle w:val="Ttulo2"/>
+        <w:rPr>
+          <w:rFonts w:ascii="Times New Roman" w:hAnsi="Times New Roman" w:cs="Times New Roman"/>
+        </w:rPr>
+      </w:pPr>
+      <w:r>
+        <w:rPr>
+          <w:rFonts w:ascii="Times New Roman" w:hAnsi="Times New Roman" w:cs="Times New Roman"/>
+          <w:b/>
+          <w:bCs w:val="0"/>
+        </w:rPr>
+        <w:lastRenderedPageBreak/>
+        <w:t xml:space="preserve">3.4.3 </w:t>
+      </w:r>
+      <w:r>
+        <w:rPr>
+          <w:rFonts w:ascii="Times New Roman" w:hAnsi="Times New Roman" w:cs="Times New Roman"/>
+          <w:b/>
+          <w:bCs w:val="0"/>
+        </w:rPr>
+        <w:t>Resultados dos Testes Automatizados</w:t>
+      </w:r>
+      <w:r>
+        <w:rPr>
+          <w:rFonts w:ascii="Times New Roman" w:hAnsi="Times New Roman" w:cs="Times New Roman"/>
+          <w:b/>
+          <w:bCs w:val="0"/>
+        </w:rPr>
+        <w:t xml:space="preserve">: </w:t>
+      </w:r>
+    </w:p>
+    <w:p>
+      <w:pPr>
+        <w:pStyle w:val="Corpodetexto"/>
+        <w:jc w:val="both"/>
+        <w:rPr>
+          <w:rFonts w:ascii="Times New Roman" w:hAnsi="Times New Roman" w:cs="Times New Roman"/>
+        </w:rPr>
+      </w:pPr>
+    </w:p>
+    <w:p>
+      <w:pPr>
+        <w:pStyle w:val="Corpodetexto"/>
+        <w:jc w:val="both"/>
+        <w:rPr>
+          <w:rFonts w:ascii="Times New Roman" w:hAnsi="Times New Roman" w:cs="Times New Roman"/>
+        </w:rPr>
+      </w:pPr>
+      <w:r>
+        <w:rPr>
+          <w:rFonts w:ascii="Times New Roman" w:hAnsi="Times New Roman" w:cs="Times New Roman"/>
+        </w:rPr>
+        <w:t xml:space="preserve">Os testes automatizados foram implementados utilizando o framework </w:t>
+      </w:r>
+      <w:proofErr w:type="spellStart"/>
+      <w:r>
+        <w:rPr>
+          <w:rFonts w:ascii="Times New Roman" w:hAnsi="Times New Roman" w:cs="Times New Roman"/>
+        </w:rPr>
+        <w:t>Vitest</w:t>
+      </w:r>
+      <w:proofErr w:type="spellEnd"/>
+      <w:r>
+        <w:rPr>
+          <w:rFonts w:ascii="Times New Roman" w:hAnsi="Times New Roman" w:cs="Times New Roman"/>
+        </w:rPr>
+        <w:t>, que permitiu verificar o comportamento dos componentes e funcionalidades críticas da aplicação. Os testes foram organizados em dois arquivos principais:</w:t>
+      </w:r>
+    </w:p>
+    <w:p>
+      <w:pPr>
+        <w:pStyle w:val="Corpodetexto"/>
+        <w:jc w:val="both"/>
+        <w:rPr>
+          <w:rFonts w:ascii="Times New Roman" w:hAnsi="Times New Roman" w:cs="Times New Roman"/>
+        </w:rPr>
+      </w:pPr>
+    </w:p>
+    <w:p>
+      <w:pPr>
+        <w:pStyle w:val="Corpodetexto"/>
+        <w:jc w:val="both"/>
+        <w:rPr>
+          <w:rFonts w:ascii="Times New Roman" w:hAnsi="Times New Roman" w:cs="Times New Roman"/>
+        </w:rPr>
+      </w:pPr>
+      <w:proofErr w:type="spellStart"/>
+      <w:r>
+        <w:rPr>
+          <w:rFonts w:ascii="Times New Roman" w:hAnsi="Times New Roman" w:cs="Times New Roman"/>
+        </w:rPr>
+        <w:t>src</w:t>
+      </w:r>
+      <w:proofErr w:type="spellEnd"/>
+      <w:r>
+        <w:rPr>
+          <w:rFonts w:ascii="Times New Roman" w:hAnsi="Times New Roman" w:cs="Times New Roman"/>
+        </w:rPr>
+        <w:t>/__</w:t>
+      </w:r>
+      <w:proofErr w:type="spellStart"/>
+      <w:r>
+        <w:rPr>
+          <w:rFonts w:ascii="Times New Roman" w:hAnsi="Times New Roman" w:cs="Times New Roman"/>
+        </w:rPr>
+        <w:t>tests</w:t>
+      </w:r>
+      <w:proofErr w:type="spellEnd"/>
+      <w:r>
+        <w:rPr>
+          <w:rFonts w:ascii="Times New Roman" w:hAnsi="Times New Roman" w:cs="Times New Roman"/>
+        </w:rPr>
+        <w:t>__/</w:t>
+      </w:r>
+      <w:proofErr w:type="spellStart"/>
+      <w:r>
+        <w:rPr>
+          <w:rFonts w:ascii="Times New Roman" w:hAnsi="Times New Roman" w:cs="Times New Roman"/>
+        </w:rPr>
+        <w:t>auth.test.tsx</w:t>
+      </w:r>
+      <w:proofErr w:type="spellEnd"/>
+      <w:r>
+        <w:rPr>
+          <w:rFonts w:ascii="Times New Roman" w:hAnsi="Times New Roman" w:cs="Times New Roman"/>
+        </w:rPr>
+        <w:t>: Responsável por testar o fluxo de autenticação, incluindo o login, exibição de mensagens de erro e tratamento de erros inesperados.</w:t>
+      </w:r>
+    </w:p>
+    <w:p>
+      <w:pPr>
+        <w:pStyle w:val="Corpodetexto"/>
+        <w:jc w:val="both"/>
+        <w:rPr>
+          <w:rFonts w:ascii="Times New Roman" w:hAnsi="Times New Roman" w:cs="Times New Roman"/>
+        </w:rPr>
+      </w:pPr>
+      <w:proofErr w:type="spellStart"/>
+      <w:r>
+        <w:rPr>
+          <w:rFonts w:ascii="Times New Roman" w:hAnsi="Times New Roman" w:cs="Times New Roman"/>
+        </w:rPr>
+        <w:t>src</w:t>
+      </w:r>
+      <w:proofErr w:type="spellEnd"/>
+      <w:r>
+        <w:rPr>
+          <w:rFonts w:ascii="Times New Roman" w:hAnsi="Times New Roman" w:cs="Times New Roman"/>
+        </w:rPr>
+        <w:t>/__</w:t>
+      </w:r>
+      <w:proofErr w:type="spellStart"/>
+      <w:r>
+        <w:rPr>
+          <w:rFonts w:ascii="Times New Roman" w:hAnsi="Times New Roman" w:cs="Times New Roman"/>
+        </w:rPr>
+        <w:t>tests</w:t>
+      </w:r>
+      <w:proofErr w:type="spellEnd"/>
+      <w:r>
+        <w:rPr>
+          <w:rFonts w:ascii="Times New Roman" w:hAnsi="Times New Roman" w:cs="Times New Roman"/>
+        </w:rPr>
+        <w:t>__/</w:t>
+      </w:r>
+      <w:proofErr w:type="spellStart"/>
+      <w:r>
+        <w:rPr>
+          <w:rFonts w:ascii="Times New Roman" w:hAnsi="Times New Roman" w:cs="Times New Roman"/>
+        </w:rPr>
+        <w:t>NewNoteDialog.test.tsx</w:t>
+      </w:r>
+      <w:proofErr w:type="spellEnd"/>
+      <w:r>
+        <w:rPr>
+          <w:rFonts w:ascii="Times New Roman" w:hAnsi="Times New Roman" w:cs="Times New Roman"/>
+        </w:rPr>
+        <w:t>: Responsável por testar o componente de diálogo para criação de novas observações, incluindo a validação de campos obrigatórios e o estado de carregamento durante a submissão.</w:t>
+      </w:r>
+    </w:p>
+    <w:p>
+      <w:pPr>
+        <w:pStyle w:val="Corpodetexto"/>
+        <w:jc w:val="both"/>
+        <w:rPr>
+          <w:rFonts w:ascii="Times New Roman" w:hAnsi="Times New Roman" w:cs="Times New Roman"/>
+        </w:rPr>
+      </w:pPr>
+      <w:r>
+        <w:rPr>
+          <w:rFonts w:ascii="Times New Roman" w:hAnsi="Times New Roman" w:cs="Times New Roman"/>
+        </w:rPr>
+        <w:t>Resultados Detalhados</w:t>
+      </w:r>
+    </w:p>
+    <w:p>
+      <w:pPr>
+        <w:pStyle w:val="Corpodetexto"/>
+        <w:jc w:val="both"/>
+        <w:rPr>
+          <w:rFonts w:ascii="Times New Roman" w:hAnsi="Times New Roman" w:cs="Times New Roman"/>
+        </w:rPr>
+      </w:pPr>
+    </w:p>
+    <w:p>
+      <w:pPr>
+        <w:pStyle w:val="Corpodetexto"/>
+        <w:jc w:val="both"/>
+        <w:rPr>
+          <w:rFonts w:ascii="Times New Roman" w:hAnsi="Times New Roman" w:cs="Times New Roman"/>
+        </w:rPr>
+      </w:pPr>
+      <w:r>
+        <w:rPr>
+          <w:rFonts w:ascii="Times New Roman" w:hAnsi="Times New Roman" w:cs="Times New Roman"/>
+        </w:rPr>
+        <w:t>A execução dos testes resultou em 14 testes aprovados, distribuídos da seguinte forma:</w:t>
+      </w:r>
+    </w:p>
+    <w:p>
+      <w:pPr>
+        <w:pStyle w:val="Corpodetexto"/>
+        <w:jc w:val="both"/>
+        <w:rPr>
+          <w:rFonts w:ascii="Times New Roman" w:hAnsi="Times New Roman" w:cs="Times New Roman"/>
+        </w:rPr>
+      </w:pPr>
+    </w:p>
+    <w:p>
+      <w:pPr>
+        <w:pStyle w:val="Corpodetexto"/>
+        <w:jc w:val="both"/>
+        <w:rPr>
+          <w:rFonts w:ascii="Times New Roman" w:hAnsi="Times New Roman" w:cs="Times New Roman"/>
+        </w:rPr>
+      </w:pPr>
+      <w:proofErr w:type="spellStart"/>
+      <w:r>
+        <w:rPr>
+          <w:rFonts w:ascii="Times New Roman" w:hAnsi="Times New Roman" w:cs="Times New Roman"/>
+        </w:rPr>
+        <w:t>src</w:t>
+      </w:r>
+      <w:proofErr w:type="spellEnd"/>
+      <w:r>
+        <w:rPr>
+          <w:rFonts w:ascii="Times New Roman" w:hAnsi="Times New Roman" w:cs="Times New Roman"/>
+        </w:rPr>
+        <w:t>/__</w:t>
+      </w:r>
+      <w:proofErr w:type="spellStart"/>
+      <w:r>
+        <w:rPr>
+          <w:rFonts w:ascii="Times New Roman" w:hAnsi="Times New Roman" w:cs="Times New Roman"/>
+        </w:rPr>
+        <w:t>tests</w:t>
+      </w:r>
+      <w:proofErr w:type="spellEnd"/>
+      <w:r>
+        <w:rPr>
+          <w:rFonts w:ascii="Times New Roman" w:hAnsi="Times New Roman" w:cs="Times New Roman"/>
+        </w:rPr>
+        <w:t>__/</w:t>
+      </w:r>
+      <w:proofErr w:type="spellStart"/>
+      <w:r>
+        <w:rPr>
+          <w:rFonts w:ascii="Times New Roman" w:hAnsi="Times New Roman" w:cs="Times New Roman"/>
+        </w:rPr>
+        <w:t>auth.test.tsx</w:t>
+      </w:r>
+      <w:proofErr w:type="spellEnd"/>
+      <w:r>
+        <w:rPr>
+          <w:rFonts w:ascii="Times New Roman" w:hAnsi="Times New Roman" w:cs="Times New Roman"/>
+        </w:rPr>
+        <w:t>: 9 testes aprovados</w:t>
+      </w:r>
+    </w:p>
+    <w:p>
+      <w:pPr>
+        <w:pStyle w:val="Corpodetexto"/>
+        <w:jc w:val="both"/>
+        <w:rPr>
+          <w:rFonts w:ascii="Times New Roman" w:hAnsi="Times New Roman" w:cs="Times New Roman"/>
+        </w:rPr>
+      </w:pPr>
+      <w:r>
+        <w:rPr>
+          <w:rFonts w:ascii="Times New Roman" w:hAnsi="Times New Roman" w:cs="Times New Roman"/>
+        </w:rPr>
+        <w:t xml:space="preserve"> deve corresponder ao snapshot da UI</w:t>
+      </w:r>
+    </w:p>
+    <w:p>
+      <w:pPr>
+        <w:pStyle w:val="Corpodetexto"/>
+        <w:jc w:val="both"/>
+        <w:rPr>
+          <w:rFonts w:ascii="Times New Roman" w:hAnsi="Times New Roman" w:cs="Times New Roman"/>
+        </w:rPr>
+      </w:pPr>
+      <w:r>
+        <w:rPr>
+          <w:rFonts w:ascii="Times New Roman" w:hAnsi="Times New Roman" w:cs="Times New Roman"/>
+        </w:rPr>
+        <w:t xml:space="preserve"> deve permitir que o usuário digite credenciais e clique em entrar</w:t>
+      </w:r>
+    </w:p>
+    <w:p>
+      <w:pPr>
+        <w:pStyle w:val="Corpodetexto"/>
+        <w:jc w:val="both"/>
+        <w:rPr>
+          <w:rFonts w:ascii="Times New Roman" w:hAnsi="Times New Roman" w:cs="Times New Roman"/>
+        </w:rPr>
+      </w:pPr>
+      <w:r>
+        <w:rPr>
+          <w:rFonts w:ascii="Times New Roman" w:hAnsi="Times New Roman" w:cs="Times New Roman"/>
+        </w:rPr>
+        <w:t xml:space="preserve"> deve exibir mensagem de erro quando as credenciais são inválidas</w:t>
+      </w:r>
+    </w:p>
+    <w:p>
+      <w:pPr>
+        <w:pStyle w:val="Corpodetexto"/>
+        <w:jc w:val="both"/>
+        <w:rPr>
+          <w:rFonts w:ascii="Times New Roman" w:hAnsi="Times New Roman" w:cs="Times New Roman"/>
+        </w:rPr>
+      </w:pPr>
+      <w:r>
+        <w:rPr>
+          <w:rFonts w:ascii="Times New Roman" w:hAnsi="Times New Roman" w:cs="Times New Roman"/>
+        </w:rPr>
+        <w:t xml:space="preserve"> deve tratar erros inesperados no login (catch </w:t>
+      </w:r>
+      <w:proofErr w:type="spellStart"/>
+      <w:r>
+        <w:rPr>
+          <w:rFonts w:ascii="Times New Roman" w:hAnsi="Times New Roman" w:cs="Times New Roman"/>
+        </w:rPr>
+        <w:t>block</w:t>
+      </w:r>
+      <w:proofErr w:type="spellEnd"/>
+      <w:r>
+        <w:rPr>
+          <w:rFonts w:ascii="Times New Roman" w:hAnsi="Times New Roman" w:cs="Times New Roman"/>
+        </w:rPr>
+        <w:t>)</w:t>
+      </w:r>
+    </w:p>
+    <w:p>
+      <w:pPr>
+        <w:pStyle w:val="Corpodetexto"/>
+        <w:jc w:val="both"/>
+        <w:rPr>
+          <w:rFonts w:ascii="Times New Roman" w:hAnsi="Times New Roman" w:cs="Times New Roman"/>
+        </w:rPr>
+      </w:pPr>
+      <w:r>
+        <w:rPr>
+          <w:rFonts w:ascii="Times New Roman" w:hAnsi="Times New Roman" w:cs="Times New Roman"/>
+        </w:rPr>
+        <w:t xml:space="preserve"> deve redirecionar (não renderizar o </w:t>
+      </w:r>
+      <w:proofErr w:type="spellStart"/>
+      <w:r>
+        <w:rPr>
+          <w:rFonts w:ascii="Times New Roman" w:hAnsi="Times New Roman" w:cs="Times New Roman"/>
+        </w:rPr>
+        <w:t>form</w:t>
+      </w:r>
+      <w:proofErr w:type="spellEnd"/>
+      <w:r>
+        <w:rPr>
+          <w:rFonts w:ascii="Times New Roman" w:hAnsi="Times New Roman" w:cs="Times New Roman"/>
+        </w:rPr>
+        <w:t>) se o usuário já estiver logado</w:t>
+      </w:r>
+    </w:p>
+    <w:p>
+      <w:pPr>
+        <w:pStyle w:val="Corpodetexto"/>
+        <w:jc w:val="both"/>
+        <w:rPr>
+          <w:rFonts w:ascii="Times New Roman" w:hAnsi="Times New Roman" w:cs="Times New Roman"/>
+        </w:rPr>
+      </w:pPr>
+      <w:r>
+        <w:rPr>
+          <w:rFonts w:ascii="Times New Roman" w:hAnsi="Times New Roman" w:cs="Times New Roman"/>
+        </w:rPr>
+        <w:t xml:space="preserve"> deve baixar o APK ao clicar em instalar no Android</w:t>
+      </w:r>
+    </w:p>
+    <w:p>
+      <w:pPr>
+        <w:pStyle w:val="Corpodetexto"/>
+        <w:jc w:val="both"/>
+        <w:rPr>
+          <w:rFonts w:ascii="Times New Roman" w:hAnsi="Times New Roman" w:cs="Times New Roman"/>
+        </w:rPr>
+      </w:pPr>
+      <w:r>
+        <w:rPr>
+          <w:rFonts w:ascii="Times New Roman" w:hAnsi="Times New Roman" w:cs="Times New Roman"/>
+        </w:rPr>
+        <w:t xml:space="preserve"> deve mostrar instrução de instalação no iOS</w:t>
+      </w:r>
+    </w:p>
+    <w:p>
+      <w:pPr>
+        <w:pStyle w:val="Corpodetexto"/>
+        <w:jc w:val="both"/>
+        <w:rPr>
+          <w:rFonts w:ascii="Times New Roman" w:hAnsi="Times New Roman" w:cs="Times New Roman"/>
+        </w:rPr>
+      </w:pPr>
+      <w:r>
+        <w:rPr>
+          <w:rFonts w:ascii="Times New Roman" w:hAnsi="Times New Roman" w:cs="Times New Roman"/>
+        </w:rPr>
+        <w:t xml:space="preserve"> deve usar o prompt de instalação PWA se disponível (Desktop/Mobile)</w:t>
+      </w:r>
+    </w:p>
+    <w:p>
+      <w:pPr>
+        <w:pStyle w:val="Corpodetexto"/>
+        <w:jc w:val="both"/>
+        <w:rPr>
+          <w:rFonts w:ascii="Times New Roman" w:hAnsi="Times New Roman" w:cs="Times New Roman"/>
+        </w:rPr>
+      </w:pPr>
+      <w:r>
+        <w:rPr>
+          <w:rFonts w:ascii="Times New Roman" w:hAnsi="Times New Roman" w:cs="Times New Roman"/>
+        </w:rPr>
+        <w:t xml:space="preserve"> deve baixar o APK como </w:t>
+      </w:r>
+      <w:proofErr w:type="spellStart"/>
+      <w:r>
+        <w:rPr>
+          <w:rFonts w:ascii="Times New Roman" w:hAnsi="Times New Roman" w:cs="Times New Roman"/>
+        </w:rPr>
+        <w:t>fallback</w:t>
+      </w:r>
+      <w:proofErr w:type="spellEnd"/>
+      <w:r>
+        <w:rPr>
+          <w:rFonts w:ascii="Times New Roman" w:hAnsi="Times New Roman" w:cs="Times New Roman"/>
+        </w:rPr>
+        <w:t xml:space="preserve"> em Desktop/Outros (sem PWA prompt)</w:t>
+      </w:r>
+    </w:p>
+    <w:p>
+      <w:pPr>
+        <w:pStyle w:val="Corpodetexto"/>
+        <w:jc w:val="both"/>
+        <w:rPr>
+          <w:rFonts w:ascii="Times New Roman" w:hAnsi="Times New Roman" w:cs="Times New Roman"/>
+        </w:rPr>
+      </w:pPr>
+      <w:proofErr w:type="spellStart"/>
+      <w:r>
+        <w:rPr>
+          <w:rFonts w:ascii="Times New Roman" w:hAnsi="Times New Roman" w:cs="Times New Roman"/>
+        </w:rPr>
+        <w:t>src</w:t>
+      </w:r>
+      <w:proofErr w:type="spellEnd"/>
+      <w:r>
+        <w:rPr>
+          <w:rFonts w:ascii="Times New Roman" w:hAnsi="Times New Roman" w:cs="Times New Roman"/>
+        </w:rPr>
+        <w:t>/__</w:t>
+      </w:r>
+      <w:proofErr w:type="spellStart"/>
+      <w:r>
+        <w:rPr>
+          <w:rFonts w:ascii="Times New Roman" w:hAnsi="Times New Roman" w:cs="Times New Roman"/>
+        </w:rPr>
+        <w:t>tests</w:t>
+      </w:r>
+      <w:proofErr w:type="spellEnd"/>
+      <w:r>
+        <w:rPr>
+          <w:rFonts w:ascii="Times New Roman" w:hAnsi="Times New Roman" w:cs="Times New Roman"/>
+        </w:rPr>
+        <w:t>__/</w:t>
+      </w:r>
+      <w:proofErr w:type="spellStart"/>
+      <w:r>
+        <w:rPr>
+          <w:rFonts w:ascii="Times New Roman" w:hAnsi="Times New Roman" w:cs="Times New Roman"/>
+        </w:rPr>
+        <w:t>NewNoteDialog.test.tsx</w:t>
+      </w:r>
+      <w:proofErr w:type="spellEnd"/>
+      <w:r>
+        <w:rPr>
+          <w:rFonts w:ascii="Times New Roman" w:hAnsi="Times New Roman" w:cs="Times New Roman"/>
+        </w:rPr>
+        <w:t>: 5 testes aprovados</w:t>
+      </w:r>
+    </w:p>
+    <w:p>
+      <w:pPr>
+        <w:pStyle w:val="Corpodetexto"/>
+        <w:jc w:val="both"/>
+        <w:rPr>
+          <w:rFonts w:ascii="Times New Roman" w:hAnsi="Times New Roman" w:cs="Times New Roman"/>
+        </w:rPr>
+      </w:pPr>
+      <w:r>
+        <w:rPr>
+          <w:rFonts w:ascii="Times New Roman" w:hAnsi="Times New Roman" w:cs="Times New Roman"/>
+        </w:rPr>
+        <w:t xml:space="preserve"> deve renderizar corretamente quando aberto</w:t>
+      </w:r>
+    </w:p>
+    <w:p>
+      <w:pPr>
+        <w:pStyle w:val="Corpodetexto"/>
+        <w:jc w:val="both"/>
+        <w:rPr>
+          <w:rFonts w:ascii="Times New Roman" w:hAnsi="Times New Roman" w:cs="Times New Roman"/>
+        </w:rPr>
+      </w:pPr>
+      <w:r>
+        <w:rPr>
+          <w:rFonts w:ascii="Times New Roman" w:hAnsi="Times New Roman" w:cs="Times New Roman"/>
+        </w:rPr>
+        <w:t xml:space="preserve"> deve validar campos obrigatórios (impedir envio vazio)</w:t>
+      </w:r>
+    </w:p>
+    <w:p>
+      <w:pPr>
+        <w:pStyle w:val="Corpodetexto"/>
+        <w:jc w:val="both"/>
+        <w:rPr>
+          <w:rFonts w:ascii="Times New Roman" w:hAnsi="Times New Roman" w:cs="Times New Roman"/>
+        </w:rPr>
+      </w:pPr>
+      <w:r>
+        <w:rPr>
+          <w:rFonts w:ascii="Times New Roman" w:hAnsi="Times New Roman" w:cs="Times New Roman"/>
+        </w:rPr>
+        <w:t xml:space="preserve"> deve validar o comprimento mínimo da nota</w:t>
+      </w:r>
+    </w:p>
+    <w:p>
+      <w:pPr>
+        <w:pStyle w:val="Corpodetexto"/>
+        <w:jc w:val="both"/>
+        <w:rPr>
+          <w:rFonts w:ascii="Times New Roman" w:hAnsi="Times New Roman" w:cs="Times New Roman"/>
+        </w:rPr>
+      </w:pPr>
+      <w:r>
+        <w:rPr>
+          <w:rFonts w:ascii="Times New Roman" w:hAnsi="Times New Roman" w:cs="Times New Roman"/>
+        </w:rPr>
+        <w:t xml:space="preserve"> deve chamar a mutação com os dados corretos ao submeter formulário válido</w:t>
+      </w:r>
+    </w:p>
+    <w:p>
+      <w:pPr>
+        <w:pStyle w:val="Corpodetexto"/>
+        <w:jc w:val="both"/>
+        <w:rPr>
+          <w:rFonts w:ascii="Times New Roman" w:hAnsi="Times New Roman" w:cs="Times New Roman"/>
+        </w:rPr>
+      </w:pPr>
+      <w:r>
+        <w:rPr>
+          <w:rFonts w:ascii="Times New Roman" w:hAnsi="Times New Roman" w:cs="Times New Roman"/>
+        </w:rPr>
+        <w:lastRenderedPageBreak/>
+        <w:t xml:space="preserve"> deve exibir estado de carregamento durante a submissão</w:t>
+      </w:r>
+    </w:p>
+    <w:p>
+      <w:pPr>
+        <w:pStyle w:val="Corpodetexto"/>
+        <w:jc w:val="both"/>
+        <w:rPr>
+          <w:rFonts w:ascii="Times New Roman" w:hAnsi="Times New Roman" w:cs="Times New Roman"/>
+        </w:rPr>
+      </w:pPr>
+    </w:p>
+    <w:p>
+      <w:pPr>
+        <w:pStyle w:val="Corpodetexto"/>
+        <w:jc w:val="both"/>
+        <w:rPr>
+          <w:rFonts w:ascii="Times New Roman" w:hAnsi="Times New Roman" w:cs="Times New Roman"/>
+        </w:rPr>
+      </w:pPr>
+      <w:r>
+        <w:rPr>
+          <w:rFonts w:ascii="Times New Roman" w:hAnsi="Times New Roman" w:cs="Times New Roman"/>
+        </w:rPr>
+        <w:t>Observações</w:t>
+      </w:r>
+    </w:p>
+    <w:p>
+      <w:pPr>
+        <w:pStyle w:val="Corpodetexto"/>
+        <w:jc w:val="both"/>
+        <w:rPr>
+          <w:rFonts w:ascii="Times New Roman" w:hAnsi="Times New Roman" w:cs="Times New Roman"/>
+        </w:rPr>
+      </w:pPr>
+    </w:p>
+    <w:p>
+      <w:pPr>
+        <w:pStyle w:val="Corpodetexto"/>
+        <w:jc w:val="both"/>
+        <w:rPr>
+          <w:rFonts w:ascii="Times New Roman" w:hAnsi="Times New Roman" w:cs="Times New Roman"/>
+        </w:rPr>
+      </w:pPr>
+      <w:r>
+        <w:rPr>
+          <w:rFonts w:ascii="Times New Roman" w:hAnsi="Times New Roman" w:cs="Times New Roman"/>
+        </w:rPr>
+        <w:t xml:space="preserve">Durante a execução dos testes, foram identificados alguns avisos relacionados ao </w:t>
+      </w:r>
+      <w:proofErr w:type="spellStart"/>
+      <w:r>
+        <w:rPr>
+          <w:rFonts w:ascii="Times New Roman" w:hAnsi="Times New Roman" w:cs="Times New Roman"/>
+        </w:rPr>
+        <w:t>React</w:t>
+      </w:r>
+      <w:proofErr w:type="spellEnd"/>
+      <w:r>
+        <w:rPr>
+          <w:rFonts w:ascii="Times New Roman" w:hAnsi="Times New Roman" w:cs="Times New Roman"/>
+        </w:rPr>
+        <w:t xml:space="preserve"> </w:t>
+      </w:r>
+      <w:proofErr w:type="spellStart"/>
+      <w:r>
+        <w:rPr>
+          <w:rFonts w:ascii="Times New Roman" w:hAnsi="Times New Roman" w:cs="Times New Roman"/>
+        </w:rPr>
+        <w:t>Router</w:t>
+      </w:r>
+      <w:proofErr w:type="spellEnd"/>
+      <w:r>
+        <w:rPr>
+          <w:rFonts w:ascii="Times New Roman" w:hAnsi="Times New Roman" w:cs="Times New Roman"/>
+        </w:rPr>
+        <w:t>, indicando a necessidade de avaliar a compatibilidade com futuras versões da biblioteca.</w:t>
+      </w:r>
+    </w:p>
+    <w:p>
+      <w:pPr>
+        <w:pStyle w:val="Corpodetexto"/>
+      </w:pPr>
+    </w:p>
+    <w:p>
+      <w:pPr>
+        <w:pStyle w:val="Ttulo2"/>
         <w:jc w:val="both"/>
         <w:rPr>
           <w:rStyle w:val="Forte"/>
@@ -8304,7 +8978,6 @@
           <w:bCs w:val="0"/>
           <w:sz w:val="28"/>
         </w:rPr>
-        <w:lastRenderedPageBreak/>
         <w:t>3.</w:t>
       </w:r>
       <w:r>
@@ -8733,8 +9406,8 @@
           <w:szCs w:val="32"/>
         </w:rPr>
       </w:pPr>
-      <w:bookmarkStart w:id="103" w:name="_Toc216996119"/>
-      <w:bookmarkStart w:id="104" w:name="_Toc217772214"/>
+      <w:bookmarkStart w:id="103" w:name="_Toc217772214"/>
+      <w:bookmarkStart w:id="104" w:name="_Toc216996119"/>
       <w:r>
         <w:rPr>
           <w:rFonts w:ascii="Times New Roman" w:hAnsi="Times New Roman" w:cs="Times New Roman"/>
@@ -8775,7 +9448,7 @@
         </w:rPr>
         <w:t>Desenvolvimento de Aplicação Nativa (Android APK)</w:t>
       </w:r>
-      <w:bookmarkEnd w:id="104"/>
+      <w:bookmarkEnd w:id="103"/>
       <w:r>
         <w:rPr>
           <w:rFonts w:ascii="Times New Roman" w:hAnsi="Times New Roman" w:cs="Times New Roman"/>
@@ -8787,7 +9460,7 @@
         <w:t xml:space="preserve"> </w:t>
       </w:r>
     </w:p>
-    <w:bookmarkEnd w:id="103"/>
+    <w:bookmarkEnd w:id="104"/>
     <w:p>
       <w:pPr>
         <w:pStyle w:val="Corpodetexto"/>
@@ -8868,7 +9541,16 @@
           <w:color w:val="000000" w:themeColor="text1"/>
           <w:lang w:eastAsia="pt-BR"/>
         </w:rPr>
-        <w:t> multiplataforma que permite a execução de aplicações web modernas em dispositivos nativos. Esta abordagem estratégica possibilitou o reaproveitamento integral da base de código desenvolvida em </w:t>
+        <w:t xml:space="preserve"> multiplataforma que permite a execução de aplicações web </w:t>
+      </w:r>
+      <w:r>
+        <w:rPr>
+          <w:rFonts w:ascii="Times New Roman" w:eastAsia="Times New Roman" w:hAnsi="Times New Roman" w:cs="Times New Roman"/>
+          <w:color w:val="000000" w:themeColor="text1"/>
+          <w:lang w:eastAsia="pt-BR"/>
+        </w:rPr>
+        <w:lastRenderedPageBreak/>
+        <w:t>modernas em dispositivos nativos. Esta abordagem estratégica possibilitou o reaproveitamento integral da base de código desenvolvida em </w:t>
       </w:r>
       <w:proofErr w:type="spellStart"/>
       <w:r>
@@ -9032,7 +9714,6 @@
           <w:color w:val="000000" w:themeColor="text1"/>
           <w:lang w:eastAsia="pt-BR"/>
         </w:rPr>
-        <w:lastRenderedPageBreak/>
         <w:t>O processo de geração do artefato instalável (APK - </w:t>
       </w:r>
       <w:r>
@@ -9859,8 +10540,21 @@
           <w:rFonts w:ascii="Times New Roman" w:hAnsi="Times New Roman" w:cs="Times New Roman"/>
           <w:color w:val="000000" w:themeColor="text1"/>
         </w:rPr>
-        <w:lastRenderedPageBreak/>
-        <w:t>A auditoria, finalizada em dezembro de 2025, indicou que a aplicação atingiu um nível satisfatório de maturidade de segurança, não apresentando vulnerabilidades críticas exploráveis no escopo avaliado.</w:t>
+        <w:t xml:space="preserve">A auditoria, finalizada em dezembro de </w:t>
+      </w:r>
+      <w:r>
+        <w:rPr>
+          <w:rFonts w:ascii="Times New Roman" w:hAnsi="Times New Roman" w:cs="Times New Roman"/>
+          <w:color w:val="000000" w:themeColor="text1"/>
+        </w:rPr>
+        <w:t>2026</w:t>
+      </w:r>
+      <w:r>
+        <w:rPr>
+          <w:rFonts w:ascii="Times New Roman" w:hAnsi="Times New Roman" w:cs="Times New Roman"/>
+          <w:color w:val="000000" w:themeColor="text1"/>
+        </w:rPr>
+        <w:t>, indicou que a aplicação atingiu um nível satisfatório de maturidade de segurança, não apresentando vulnerabilidades críticas exploráveis no escopo avaliado.</w:t>
       </w:r>
     </w:p>
     <w:p>
@@ -10475,14 +11169,14 @@
         <w:rPr>
           <w:rFonts w:ascii="Times New Roman" w:hAnsi="Times New Roman" w:cs="Times New Roman"/>
         </w:rPr>
-        <w:t>Type</w:t>
-      </w:r>
-      <w:proofErr w:type="spellEnd"/>
-      <w:r>
-        <w:rPr>
-          <w:rFonts w:ascii="Times New Roman" w:hAnsi="Times New Roman" w:cs="Times New Roman"/>
-        </w:rPr>
-        <w:t xml:space="preserve">-Options: </w:t>
+        <w:t>Type-Options</w:t>
+      </w:r>
+      <w:proofErr w:type="spellEnd"/>
+      <w:r>
+        <w:rPr>
+          <w:rFonts w:ascii="Times New Roman" w:hAnsi="Times New Roman" w:cs="Times New Roman"/>
+        </w:rPr>
+        <w:t xml:space="preserve">: </w:t>
       </w:r>
       <w:proofErr w:type="spellStart"/>
       <w:r>
@@ -10663,7 +11357,23 @@
           <w:rFonts w:ascii="Times New Roman" w:hAnsi="Times New Roman" w:cs="Times New Roman"/>
           <w:b/>
         </w:rPr>
-        <w:t xml:space="preserve"> e Canary </w:t>
+        <w:t xml:space="preserve"> e </w:t>
+      </w:r>
+      <w:proofErr w:type="spellStart"/>
+      <w:r>
+        <w:rPr>
+          <w:rFonts w:ascii="Times New Roman" w:hAnsi="Times New Roman" w:cs="Times New Roman"/>
+          <w:b/>
+        </w:rPr>
+        <w:t>Canary</w:t>
+      </w:r>
+      <w:proofErr w:type="spellEnd"/>
+      <w:r>
+        <w:rPr>
+          <w:rFonts w:ascii="Times New Roman" w:hAnsi="Times New Roman" w:cs="Times New Roman"/>
+          <w:b/>
+        </w:rPr>
+        <w:t xml:space="preserve"> </w:t>
       </w:r>
       <w:proofErr w:type="spellStart"/>
       <w:r>
@@ -10827,7 +11537,25 @@
           <w:i/>
           <w:iCs/>
         </w:rPr>
-        <w:t xml:space="preserve"> Event Management</w:t>
+        <w:t xml:space="preserve"> </w:t>
+      </w:r>
+      <w:proofErr w:type="spellStart"/>
+      <w:r>
+        <w:rPr>
+          <w:rFonts w:ascii="Times New Roman" w:hAnsi="Times New Roman" w:cs="Times New Roman"/>
+          <w:i/>
+          <w:iCs/>
+        </w:rPr>
+        <w:t>Event</w:t>
+      </w:r>
+      <w:proofErr w:type="spellEnd"/>
+      <w:r>
+        <w:rPr>
+          <w:rFonts w:ascii="Times New Roman" w:hAnsi="Times New Roman" w:cs="Times New Roman"/>
+          <w:i/>
+          <w:iCs/>
+        </w:rPr>
+        <w:t xml:space="preserve"> Management</w:t>
       </w:r>
       <w:r>
         <w:rPr>
@@ -11882,7 +12610,23 @@
           <w:i/>
           <w:iCs/>
         </w:rPr>
-        <w:t>Fonte: Elaborado pelo autor (2025).</w:t>
+        <w:t>Fonte: Elaborado pelo autor (</w:t>
+      </w:r>
+      <w:r>
+        <w:rPr>
+          <w:rFonts w:ascii="Times New Roman" w:hAnsi="Times New Roman" w:cs="Times New Roman"/>
+          <w:i/>
+          <w:iCs/>
+        </w:rPr>
+        <w:t>2026</w:t>
+      </w:r>
+      <w:r>
+        <w:rPr>
+          <w:rFonts w:ascii="Times New Roman" w:hAnsi="Times New Roman" w:cs="Times New Roman"/>
+          <w:i/>
+          <w:iCs/>
+        </w:rPr>
+        <w:t>).</w:t>
       </w:r>
       <w:bookmarkEnd w:id="260"/>
       <w:bookmarkEnd w:id="261"/>
@@ -11951,9 +12695,16 @@
           <w:color w:val="000000" w:themeColor="text1"/>
         </w:rPr>
         <w:lastRenderedPageBreak/>
-        <w:t>5. EXECUÇÃO E ANÁLISE DOS TESTES DE SEGURANÇA</w:t>
+        <w:t>5. E</w:t>
       </w:r>
       <w:bookmarkEnd w:id="270"/>
+      <w:r>
+        <w:rPr>
+          <w:rFonts w:ascii="Times New Roman" w:hAnsi="Times New Roman" w:cs="Times New Roman"/>
+          <w:color w:val="000000" w:themeColor="text1"/>
+        </w:rPr>
+        <w:t xml:space="preserve">xecução e Análise dos Testes de Segurança </w:t>
+      </w:r>
     </w:p>
     <w:p>
       <w:pPr>
@@ -13128,14 +13879,14 @@
         <w:rPr>
           <w:rFonts w:ascii="Times New Roman" w:hAnsi="Times New Roman" w:cs="Times New Roman"/>
         </w:rPr>
-        <w:t>Type</w:t>
-      </w:r>
-      <w:proofErr w:type="spellEnd"/>
-      <w:r>
-        <w:rPr>
-          <w:rFonts w:ascii="Times New Roman" w:hAnsi="Times New Roman" w:cs="Times New Roman"/>
-        </w:rPr>
-        <w:t xml:space="preserve">-Options: </w:t>
+        <w:t>Type-Options</w:t>
+      </w:r>
+      <w:proofErr w:type="spellEnd"/>
+      <w:r>
+        <w:rPr>
+          <w:rFonts w:ascii="Times New Roman" w:hAnsi="Times New Roman" w:cs="Times New Roman"/>
+        </w:rPr>
+        <w:t xml:space="preserve">: </w:t>
       </w:r>
       <w:proofErr w:type="spellStart"/>
       <w:r>
@@ -13977,7 +14728,25 @@
           <w:i/>
           <w:iCs/>
         </w:rPr>
-        <w:t xml:space="preserve"> Event Management</w:t>
+        <w:t xml:space="preserve"> </w:t>
+      </w:r>
+      <w:proofErr w:type="spellStart"/>
+      <w:r>
+        <w:rPr>
+          <w:rFonts w:ascii="Times New Roman" w:hAnsi="Times New Roman" w:cs="Times New Roman"/>
+          <w:i/>
+          <w:iCs/>
+        </w:rPr>
+        <w:t>Event</w:t>
+      </w:r>
+      <w:proofErr w:type="spellEnd"/>
+      <w:r>
+        <w:rPr>
+          <w:rFonts w:ascii="Times New Roman" w:hAnsi="Times New Roman" w:cs="Times New Roman"/>
+          <w:i/>
+          <w:iCs/>
+        </w:rPr>
+        <w:t xml:space="preserve"> Management</w:t>
       </w:r>
       <w:r>
         <w:rPr>
@@ -14087,7 +14856,13 @@
         </w:r>
       </w:hyperlink>
       <w:r>
-        <w:t>. Acesso em: 15 dez. 2025.</w:t>
+        <w:t xml:space="preserve">. Acesso em: 15 dez. </w:t>
+      </w:r>
+      <w:r>
+        <w:t>2026</w:t>
+      </w:r>
+      <w:r>
+        <w:t>.</w:t>
       </w:r>
     </w:p>
     <w:p>
@@ -14117,7 +14892,13 @@
         </w:r>
       </w:hyperlink>
       <w:r>
-        <w:t>. Acesso em: 15 dez. 2025.</w:t>
+        <w:t xml:space="preserve">. Acesso em: 15 dez. </w:t>
+      </w:r>
+      <w:r>
+        <w:t>2026</w:t>
+      </w:r>
+      <w:r>
+        <w:t>.</w:t>
       </w:r>
     </w:p>
     <w:p>
@@ -14155,7 +14936,13 @@
         <w:t>Gestão Atípicos: Sistema Web para Gestão Especializada de Alunos Atípicos na Educação Inclusiva</w:t>
       </w:r>
       <w:r>
-        <w:t xml:space="preserve">. 2025. Repositório de código (GitHub). Disponível em: </w:t>
+        <w:t xml:space="preserve">. </w:t>
+      </w:r>
+      <w:r>
+        <w:t>2026</w:t>
+      </w:r>
+      <w:r>
+        <w:t xml:space="preserve">. Repositório de código (GitHub). Disponível em: </w:t>
       </w:r>
       <w:hyperlink r:id="rId10" w:tgtFrame="_blank" w:history="1">
         <w:r>
@@ -14166,7 +14953,13 @@
         </w:r>
       </w:hyperlink>
       <w:r>
-        <w:t>. Acesso em: 19 dez. 2025.</w:t>
+        <w:t xml:space="preserve">. Acesso em: 19 dez. </w:t>
+      </w:r>
+      <w:r>
+        <w:t>2026</w:t>
+      </w:r>
+      <w:r>
+        <w:t>.</w:t>
       </w:r>
     </w:p>
     <w:p>
@@ -14201,7 +14994,13 @@
         <w:t xml:space="preserve"> Model</w:t>
       </w:r>
       <w:r>
-        <w:t xml:space="preserve">. Azure Security Center, 2025. Disponível em: </w:t>
+        <w:t xml:space="preserve">. Azure Security Center, </w:t>
+      </w:r>
+      <w:r>
+        <w:t>2026</w:t>
+      </w:r>
+      <w:r>
+        <w:t xml:space="preserve">. Disponível em: </w:t>
       </w:r>
       <w:hyperlink r:id="rId11" w:tgtFrame="_blank" w:history="1">
         <w:r>
@@ -14212,7 +15011,13 @@
         </w:r>
       </w:hyperlink>
       <w:r>
-        <w:t>. Acesso em: 15 dez. 2025.</w:t>
+        <w:t xml:space="preserve">. Acesso em: 15 dez. </w:t>
+      </w:r>
+      <w:r>
+        <w:t>2026</w:t>
+      </w:r>
+      <w:r>
+        <w:t>.</w:t>
       </w:r>
     </w:p>
     <w:p>
@@ -14275,7 +15080,13 @@
         </w:r>
       </w:hyperlink>
       <w:r>
-        <w:t>. Acesso em: 15 dez. 2025.</w:t>
+        <w:t xml:space="preserve">. Acesso em: 15 dez. </w:t>
+      </w:r>
+      <w:r>
+        <w:t>2026</w:t>
+      </w:r>
+      <w:r>
+        <w:t>.</w:t>
       </w:r>
     </w:p>
     <w:p>
@@ -14329,7 +15140,13 @@
         </w:r>
       </w:hyperlink>
       <w:r>
-        <w:t>. Acesso em: 15 dez. 2025.</w:t>
+        <w:t xml:space="preserve">. Acesso em: 15 dez. </w:t>
+      </w:r>
+      <w:r>
+        <w:t>2026</w:t>
+      </w:r>
+      <w:r>
+        <w:t>.</w:t>
       </w:r>
     </w:p>
     <w:p>
@@ -14372,7 +15189,13 @@
       </w:r>
       <w:proofErr w:type="spellEnd"/>
       <w:r>
-        <w:t xml:space="preserve">. 2025. Disponível em: </w:t>
+        <w:t xml:space="preserve">. </w:t>
+      </w:r>
+      <w:r>
+        <w:t>2026</w:t>
+      </w:r>
+      <w:r>
+        <w:t xml:space="preserve">. Disponível em: </w:t>
       </w:r>
       <w:hyperlink r:id="rId14" w:tgtFrame="_blank" w:history="1">
         <w:r>
@@ -14383,7 +15206,13 @@
         </w:r>
       </w:hyperlink>
       <w:r>
-        <w:t>. Acesso em: 15 dez. 2025.</w:t>
+        <w:t xml:space="preserve">. Acesso em: 15 dez. </w:t>
+      </w:r>
+      <w:r>
+        <w:t>2026</w:t>
+      </w:r>
+      <w:r>
+        <w:t>.</w:t>
       </w:r>
     </w:p>
     <w:p>
@@ -14504,8 +15333,8 @@
           <w:rFonts w:ascii="Times New Roman" w:hAnsi="Times New Roman" w:cs="Times New Roman"/>
         </w:rPr>
       </w:pPr>
-      <w:bookmarkStart w:id="378" w:name="anexo-a-capturas-de-tela"/>
-      <w:bookmarkStart w:id="379" w:name="_Toc217772283"/>
+      <w:bookmarkStart w:id="378" w:name="_Toc217772283"/>
+      <w:bookmarkStart w:id="379" w:name="anexo-a-capturas-de-tela"/>
       <w:bookmarkEnd w:id="377"/>
       <w:r>
         <w:rPr>
@@ -14513,7 +15342,7 @@
         </w:rPr>
         <w:t>Anexo A – Capturas de Tela</w:t>
       </w:r>
-      <w:bookmarkEnd w:id="379"/>
+      <w:bookmarkEnd w:id="378"/>
     </w:p>
     <w:p>
       <w:pPr>
@@ -14726,7 +15555,7 @@
         </w:drawing>
       </w:r>
       <w:bookmarkStart w:id="380" w:name="anexo-b-relatório-de-pentest"/>
-      <w:bookmarkEnd w:id="378"/>
+      <w:bookmarkEnd w:id="379"/>
     </w:p>
     <w:p>
       <w:pPr>
@@ -14980,7 +15809,19 @@
         <w:rPr>
           <w:rFonts w:ascii="Times New Roman" w:hAnsi="Times New Roman" w:cs="Times New Roman"/>
         </w:rPr>
-        <w:t>/2025).</w:t>
+        <w:t>/</w:t>
+      </w:r>
+      <w:r>
+        <w:rPr>
+          <w:rFonts w:ascii="Times New Roman" w:hAnsi="Times New Roman" w:cs="Times New Roman"/>
+        </w:rPr>
+        <w:t>2026</w:t>
+      </w:r>
+      <w:r>
+        <w:rPr>
+          <w:rFonts w:ascii="Times New Roman" w:hAnsi="Times New Roman" w:cs="Times New Roman"/>
+        </w:rPr>
+        <w:t>).</w:t>
       </w:r>
     </w:p>
     <w:p>
@@ -16449,7 +17290,6 @@
         <w:t>=</w:t>
       </w:r>
       <w:proofErr w:type="spellStart"/>
-      <w:proofErr w:type="gramStart"/>
       <w:r>
         <w:rPr>
           <w:rFonts w:ascii="Times New Roman" w:hAnsi="Times New Roman" w:cs="Times New Roman"/>
@@ -16461,14 +17301,7 @@
         <w:rPr>
           <w:rFonts w:ascii="Times New Roman" w:hAnsi="Times New Roman" w:cs="Times New Roman"/>
         </w:rPr>
-        <w:t>(</w:t>
-      </w:r>
-      <w:proofErr w:type="gramEnd"/>
-      <w:r>
-        <w:rPr>
-          <w:rFonts w:ascii="Times New Roman" w:hAnsi="Times New Roman" w:cs="Times New Roman"/>
-        </w:rPr>
-        <w:t xml:space="preserve">1)&gt; e variações em query </w:t>
+        <w:t xml:space="preserve">(1)&gt; e variações em query </w:t>
       </w:r>
       <w:proofErr w:type="spellStart"/>
       <w:r>
@@ -16651,14 +17484,14 @@
         <w:rPr>
           <w:rFonts w:ascii="Times New Roman" w:hAnsi="Times New Roman" w:cs="Times New Roman"/>
         </w:rPr>
-        <w:t>Type</w:t>
-      </w:r>
-      <w:proofErr w:type="spellEnd"/>
-      <w:r>
-        <w:rPr>
-          <w:rFonts w:ascii="Times New Roman" w:hAnsi="Times New Roman" w:cs="Times New Roman"/>
-        </w:rPr>
-        <w:t xml:space="preserve">-Options: </w:t>
+        <w:t>Type-Options</w:t>
+      </w:r>
+      <w:proofErr w:type="spellEnd"/>
+      <w:r>
+        <w:rPr>
+          <w:rFonts w:ascii="Times New Roman" w:hAnsi="Times New Roman" w:cs="Times New Roman"/>
+        </w:rPr>
+        <w:t xml:space="preserve">: </w:t>
       </w:r>
       <w:proofErr w:type="spellStart"/>
       <w:r>
@@ -17200,11 +18033,19 @@
           <w:rFonts w:ascii="Times New Roman" w:hAnsi="Times New Roman" w:cs="Times New Roman"/>
         </w:rPr>
       </w:pPr>
-      <w:r>
-        <w:rPr>
-          <w:rFonts w:ascii="Times New Roman" w:hAnsi="Times New Roman" w:cs="Times New Roman"/>
-        </w:rPr>
-        <w:t xml:space="preserve">Canary </w:t>
+      <w:proofErr w:type="spellStart"/>
+      <w:r>
+        <w:rPr>
+          <w:rFonts w:ascii="Times New Roman" w:hAnsi="Times New Roman" w:cs="Times New Roman"/>
+        </w:rPr>
+        <w:t>Canary</w:t>
+      </w:r>
+      <w:proofErr w:type="spellEnd"/>
+      <w:r>
+        <w:rPr>
+          <w:rFonts w:ascii="Times New Roman" w:hAnsi="Times New Roman" w:cs="Times New Roman"/>
+        </w:rPr>
+        <w:t xml:space="preserve"> </w:t>
       </w:r>
       <w:proofErr w:type="spellStart"/>
       <w:r>
@@ -17798,7 +18639,13 @@
               <w:rPr>
                 <w:rFonts w:ascii="Times New Roman" w:hAnsi="Times New Roman" w:cs="Times New Roman"/>
               </w:rPr>
-              <w:t>15/12/2025</w:t>
+              <w:t>15/12/</w:t>
+            </w:r>
+            <w:r>
+              <w:rPr>
+                <w:rFonts w:ascii="Times New Roman" w:hAnsi="Times New Roman" w:cs="Times New Roman"/>
+              </w:rPr>
+              <w:t>2026</w:t>
             </w:r>
           </w:p>
         </w:tc>
@@ -17858,7 +18705,21 @@
               <w:rPr>
                 <w:rFonts w:ascii="Times New Roman" w:hAnsi="Times New Roman" w:cs="Times New Roman"/>
               </w:rPr>
-              <w:t>Full Stack (</w:t>
+              <w:t xml:space="preserve">Full </w:t>
+            </w:r>
+            <w:proofErr w:type="spellStart"/>
+            <w:r>
+              <w:rPr>
+                <w:rFonts w:ascii="Times New Roman" w:hAnsi="Times New Roman" w:cs="Times New Roman"/>
+              </w:rPr>
+              <w:t>Stack</w:t>
+            </w:r>
+            <w:proofErr w:type="spellEnd"/>
+            <w:r>
+              <w:rPr>
+                <w:rFonts w:ascii="Times New Roman" w:hAnsi="Times New Roman" w:cs="Times New Roman"/>
+              </w:rPr>
+              <w:t xml:space="preserve"> (</w:t>
             </w:r>
             <w:proofErr w:type="spellStart"/>
             <w:r>
@@ -17920,7 +18781,19 @@
         <w:rPr>
           <w:rFonts w:ascii="Times New Roman" w:hAnsi="Times New Roman" w:cs="Times New Roman"/>
         </w:rPr>
-        <w:t xml:space="preserve"> 15 de dezembro de 2025 </w:t>
+        <w:t xml:space="preserve"> 15 de dezembro de </w:t>
+      </w:r>
+      <w:r>
+        <w:rPr>
+          <w:rFonts w:ascii="Times New Roman" w:hAnsi="Times New Roman" w:cs="Times New Roman"/>
+        </w:rPr>
+        <w:t>2026</w:t>
+      </w:r>
+      <w:r>
+        <w:rPr>
+          <w:rFonts w:ascii="Times New Roman" w:hAnsi="Times New Roman" w:cs="Times New Roman"/>
+        </w:rPr>
+        <w:t xml:space="preserve"> </w:t>
       </w:r>
       <w:r>
         <w:rPr>
@@ -17953,7 +18826,7 @@
 </file>
 
 <file path=word/endnotes.xml><?xml version="1.0" encoding="utf-8"?>
-<w:endnotes xmlns:wpc="http://schemas.microsoft.com/office/word/2010/wordprocessingCanvas" xmlns:cx="http://schemas.microsoft.com/office/drawing/2014/chartex" xmlns:cx1="http://schemas.microsoft.com/office/drawing/2015/9/8/chartex" xmlns:cx2="http://schemas.microsoft.com/office/drawing/2015/10/21/chartex" xmlns:cx3="http://schemas.microsoft.com/office/drawing/2016/5/9/chartex" xmlns:cx4="http://schemas.microsoft.com/office/drawing/2016/5/10/chartex" xmlns:cx5="http://schemas.microsoft.com/office/drawing/2016/5/11/chartex" xmlns:cx6="http://schemas.microsoft.com/office/drawing/2016/5/12/chartex" xmlns:cx7="http://schemas.microsoft.com/office/drawing/2016/5/13/chartex" xmlns:cx8="http://schemas.microsoft.com/office/drawing/2016/5/14/chartex" xmlns:mc="http://schemas.openxmlformats.org/markup-compatibility/2006" xmlns:aink="http://schemas.microsoft.com/office/drawing/2016/ink" xmlns:am3d="http://schemas.microsoft.com/office/drawing/2017/model3d" xmlns:o="urn:schemas-microsoft-com:office:office" xmlns:oel="http://schemas.microsoft.com/office/2019/extlst" xmlns:r="http://schemas.openxmlformats.org/officeDocument/2006/relationships" xmlns:m="http://schemas.openxmlformats.org/officeDocument/2006/math" xmlns:v="urn:schemas-microsoft-com:vml" xmlns:wp14="http://schemas.microsoft.com/office/word/2010/wordprocessingDrawing" xmlns:wp="http://schemas.openxmlformats.org/drawingml/2006/wordprocessingDrawing" xmlns:w10="urn:schemas-microsoft-com:office:word" xmlns:w="http://schemas.openxmlformats.org/wordprocessingml/2006/main" xmlns:w14="http://schemas.microsoft.com/office/word/2010/wordml" xmlns:w15="http://schemas.microsoft.com/office/word/2012/wordml" xmlns:w16cex="http://schemas.microsoft.com/office/word/2018/wordml/cex" xmlns:w16cid="http://schemas.microsoft.com/office/word/2016/wordml/cid" xmlns:w16="http://schemas.microsoft.com/office/word/2018/wordml" xmlns:w16du="http://schemas.microsoft.com/office/word/2023/wordml/word16du" xmlns:w16sdtdh="http://schemas.microsoft.com/office/word/2020/wordml/sdtdatahash" xmlns:w16sdtfl="http://schemas.microsoft.com/office/word/2024/wordml/sdtformatlock" xmlns:w16se="http://schemas.microsoft.com/office/word/2015/wordml/symex" xmlns:wpg="http://schemas.microsoft.com/office/word/2010/wordprocessingGroup" xmlns:wpi="http://schemas.microsoft.com/office/word/2010/wordprocessingInk" xmlns:wne="http://schemas.microsoft.com/office/word/2006/wordml" xmlns:wps="http://schemas.microsoft.com/office/word/2010/wordprocessingShape" mc:Ignorable="w14 w15 w16se w16cid w16 w16cex w16sdtdh w16sdtfl w16du wp14">
+<w:endnotes xmlns:wpc="http://schemas.microsoft.com/office/word/2010/wordprocessingCanvas" xmlns:cx="http://schemas.microsoft.com/office/drawing/2014/chartex" xmlns:cx1="http://schemas.microsoft.com/office/drawing/2015/9/8/chartex" xmlns:cx2="http://schemas.microsoft.com/office/drawing/2015/10/21/chartex" xmlns:cx3="http://schemas.microsoft.com/office/drawing/2016/5/9/chartex" xmlns:cx4="http://schemas.microsoft.com/office/drawing/2016/5/10/chartex" xmlns:cx5="http://schemas.microsoft.com/office/drawing/2016/5/11/chartex" xmlns:cx6="http://schemas.microsoft.com/office/drawing/2016/5/12/chartex" xmlns:cx7="http://schemas.microsoft.com/office/drawing/2016/5/13/chartex" xmlns:cx8="http://schemas.microsoft.com/office/drawing/2016/5/14/chartex" xmlns:mc="http://schemas.openxmlformats.org/markup-compatibility/2006" xmlns:aink="http://schemas.microsoft.com/office/drawing/2016/ink" xmlns:am3d="http://schemas.microsoft.com/office/drawing/2017/model3d" xmlns:o="urn:schemas-microsoft-com:office:office" xmlns:r="http://schemas.openxmlformats.org/officeDocument/2006/relationships" xmlns:m="http://schemas.openxmlformats.org/officeDocument/2006/math" xmlns:v="urn:schemas-microsoft-com:vml" xmlns:wp14="http://schemas.microsoft.com/office/word/2010/wordprocessingDrawing" xmlns:wp="http://schemas.openxmlformats.org/drawingml/2006/wordprocessingDrawing" xmlns:w10="urn:schemas-microsoft-com:office:word" xmlns:w="http://schemas.openxmlformats.org/wordprocessingml/2006/main" xmlns:w14="http://schemas.microsoft.com/office/word/2010/wordml" xmlns:w15="http://schemas.microsoft.com/office/word/2012/wordml" xmlns:w16cex="http://schemas.microsoft.com/office/word/2018/wordml/cex" xmlns:w16cid="http://schemas.microsoft.com/office/word/2016/wordml/cid" xmlns:w16="http://schemas.microsoft.com/office/word/2018/wordml" xmlns:w16sdtdh="http://schemas.microsoft.com/office/word/2020/wordml/sdtdatahash" xmlns:w16se="http://schemas.microsoft.com/office/word/2015/wordml/symex" xmlns:wpg="http://schemas.microsoft.com/office/word/2010/wordprocessingGroup" xmlns:wpi="http://schemas.microsoft.com/office/word/2010/wordprocessingInk" xmlns:wne="http://schemas.microsoft.com/office/word/2006/wordml" xmlns:wps="http://schemas.microsoft.com/office/word/2010/wordprocessingShape" mc:Ignorable="w14 w15 w16se w16cid w16 w16cex w16sdtdh wp14">
   <w:endnote w:type="separator" w:id="-1">
     <w:p>
       <w:pPr>
@@ -17978,7 +18851,7 @@
 </file>
 
 <file path=word/footnotes.xml><?xml version="1.0" encoding="utf-8"?>
-<w:footnotes xmlns:wpc="http://schemas.microsoft.com/office/word/2010/wordprocessingCanvas" xmlns:cx="http://schemas.microsoft.com/office/drawing/2014/chartex" xmlns:cx1="http://schemas.microsoft.com/office/drawing/2015/9/8/chartex" xmlns:cx2="http://schemas.microsoft.com/office/drawing/2015/10/21/chartex" xmlns:cx3="http://schemas.microsoft.com/office/drawing/2016/5/9/chartex" xmlns:cx4="http://schemas.microsoft.com/office/drawing/2016/5/10/chartex" xmlns:cx5="http://schemas.microsoft.com/office/drawing/2016/5/11/chartex" xmlns:cx6="http://schemas.microsoft.com/office/drawing/2016/5/12/chartex" xmlns:cx7="http://schemas.microsoft.com/office/drawing/2016/5/13/chartex" xmlns:cx8="http://schemas.microsoft.com/office/drawing/2016/5/14/chartex" xmlns:mc="http://schemas.openxmlformats.org/markup-compatibility/2006" xmlns:aink="http://schemas.microsoft.com/office/drawing/2016/ink" xmlns:am3d="http://schemas.microsoft.com/office/drawing/2017/model3d" xmlns:o="urn:schemas-microsoft-com:office:office" xmlns:oel="http://schemas.microsoft.com/office/2019/extlst" xmlns:r="http://schemas.openxmlformats.org/officeDocument/2006/relationships" xmlns:m="http://schemas.openxmlformats.org/officeDocument/2006/math" xmlns:v="urn:schemas-microsoft-com:vml" xmlns:wp14="http://schemas.microsoft.com/office/word/2010/wordprocessingDrawing" xmlns:wp="http://schemas.openxmlformats.org/drawingml/2006/wordprocessingDrawing" xmlns:w10="urn:schemas-microsoft-com:office:word" xmlns:w="http://schemas.openxmlformats.org/wordprocessingml/2006/main" xmlns:w14="http://schemas.microsoft.com/office/word/2010/wordml" xmlns:w15="http://schemas.microsoft.com/office/word/2012/wordml" xmlns:w16cex="http://schemas.microsoft.com/office/word/2018/wordml/cex" xmlns:w16cid="http://schemas.microsoft.com/office/word/2016/wordml/cid" xmlns:w16="http://schemas.microsoft.com/office/word/2018/wordml" xmlns:w16du="http://schemas.microsoft.com/office/word/2023/wordml/word16du" xmlns:w16sdtdh="http://schemas.microsoft.com/office/word/2020/wordml/sdtdatahash" xmlns:w16sdtfl="http://schemas.microsoft.com/office/word/2024/wordml/sdtformatlock" xmlns:w16se="http://schemas.microsoft.com/office/word/2015/wordml/symex" xmlns:wpg="http://schemas.microsoft.com/office/word/2010/wordprocessingGroup" xmlns:wpi="http://schemas.microsoft.com/office/word/2010/wordprocessingInk" xmlns:wne="http://schemas.microsoft.com/office/word/2006/wordml" xmlns:wps="http://schemas.microsoft.com/office/word/2010/wordprocessingShape" mc:Ignorable="w14 w15 w16se w16cid w16 w16cex w16sdtdh w16sdtfl w16du wp14">
+<w:footnotes xmlns:wpc="http://schemas.microsoft.com/office/word/2010/wordprocessingCanvas" xmlns:cx="http://schemas.microsoft.com/office/drawing/2014/chartex" xmlns:cx1="http://schemas.microsoft.com/office/drawing/2015/9/8/chartex" xmlns:cx2="http://schemas.microsoft.com/office/drawing/2015/10/21/chartex" xmlns:cx3="http://schemas.microsoft.com/office/drawing/2016/5/9/chartex" xmlns:cx4="http://schemas.microsoft.com/office/drawing/2016/5/10/chartex" xmlns:cx5="http://schemas.microsoft.com/office/drawing/2016/5/11/chartex" xmlns:cx6="http://schemas.microsoft.com/office/drawing/2016/5/12/chartex" xmlns:cx7="http://schemas.microsoft.com/office/drawing/2016/5/13/chartex" xmlns:cx8="http://schemas.microsoft.com/office/drawing/2016/5/14/chartex" xmlns:mc="http://schemas.openxmlformats.org/markup-compatibility/2006" xmlns:aink="http://schemas.microsoft.com/office/drawing/2016/ink" xmlns:am3d="http://schemas.microsoft.com/office/drawing/2017/model3d" xmlns:o="urn:schemas-microsoft-com:office:office" xmlns:r="http://schemas.openxmlformats.org/officeDocument/2006/relationships" xmlns:m="http://schemas.openxmlformats.org/officeDocument/2006/math" xmlns:v="urn:schemas-microsoft-com:vml" xmlns:wp14="http://schemas.microsoft.com/office/word/2010/wordprocessingDrawing" xmlns:wp="http://schemas.openxmlformats.org/drawingml/2006/wordprocessingDrawing" xmlns:w10="urn:schemas-microsoft-com:office:word" xmlns:w="http://schemas.openxmlformats.org/wordprocessingml/2006/main" xmlns:w14="http://schemas.microsoft.com/office/word/2010/wordml" xmlns:w15="http://schemas.microsoft.com/office/word/2012/wordml" xmlns:w16cex="http://schemas.microsoft.com/office/word/2018/wordml/cex" xmlns:w16cid="http://schemas.microsoft.com/office/word/2016/wordml/cid" xmlns:w16="http://schemas.microsoft.com/office/word/2018/wordml" xmlns:w16sdtdh="http://schemas.microsoft.com/office/word/2020/wordml/sdtdatahash" xmlns:w16se="http://schemas.microsoft.com/office/word/2015/wordml/symex" xmlns:wpg="http://schemas.microsoft.com/office/word/2010/wordprocessingGroup" xmlns:wpi="http://schemas.microsoft.com/office/word/2010/wordprocessingInk" xmlns:wne="http://schemas.microsoft.com/office/word/2006/wordml" xmlns:wps="http://schemas.microsoft.com/office/word/2010/wordprocessingShape" mc:Ignorable="w14 w15 w16se w16cid w16 w16cex w16sdtdh wp14">
   <w:footnote w:type="separator" w:id="-1">
     <w:p>
       <w:r>
@@ -17997,7 +18870,7 @@
 </file>
 
 <file path=word/numbering.xml><?xml version="1.0" encoding="utf-8"?>
-<w:numbering xmlns:wpc="http://schemas.microsoft.com/office/word/2010/wordprocessingCanvas" xmlns:cx="http://schemas.microsoft.com/office/drawing/2014/chartex" xmlns:cx1="http://schemas.microsoft.com/office/drawing/2015/9/8/chartex" xmlns:cx2="http://schemas.microsoft.com/office/drawing/2015/10/21/chartex" xmlns:cx3="http://schemas.microsoft.com/office/drawing/2016/5/9/chartex" xmlns:cx4="http://schemas.microsoft.com/office/drawing/2016/5/10/chartex" xmlns:cx5="http://schemas.microsoft.com/office/drawing/2016/5/11/chartex" xmlns:cx6="http://schemas.microsoft.com/office/drawing/2016/5/12/chartex" xmlns:cx7="http://schemas.microsoft.com/office/drawing/2016/5/13/chartex" xmlns:cx8="http://schemas.microsoft.com/office/drawing/2016/5/14/chartex" xmlns:mc="http://schemas.openxmlformats.org/markup-compatibility/2006" xmlns:aink="http://schemas.microsoft.com/office/drawing/2016/ink" xmlns:am3d="http://schemas.microsoft.com/office/drawing/2017/model3d" xmlns:o="urn:schemas-microsoft-com:office:office" xmlns:oel="http://schemas.microsoft.com/office/2019/extlst" xmlns:r="http://schemas.openxmlformats.org/officeDocument/2006/relationships" xmlns:m="http://schemas.openxmlformats.org/officeDocument/2006/math" xmlns:v="urn:schemas-microsoft-com:vml" xmlns:wp14="http://schemas.microsoft.com/office/word/2010/wordprocessingDrawing" xmlns:wp="http://schemas.openxmlformats.org/drawingml/2006/wordprocessingDrawing" xmlns:w10="urn:schemas-microsoft-com:office:word" xmlns:w="http://schemas.openxmlformats.org/wordprocessingml/2006/main" xmlns:w14="http://schemas.microsoft.com/office/word/2010/wordml" xmlns:w15="http://schemas.microsoft.com/office/word/2012/wordml" xmlns:w16cex="http://schemas.microsoft.com/office/word/2018/wordml/cex" xmlns:w16cid="http://schemas.microsoft.com/office/word/2016/wordml/cid" xmlns:w16="http://schemas.microsoft.com/office/word/2018/wordml" xmlns:w16du="http://schemas.microsoft.com/office/word/2023/wordml/word16du" xmlns:w16sdtdh="http://schemas.microsoft.com/office/word/2020/wordml/sdtdatahash" xmlns:w16sdtfl="http://schemas.microsoft.com/office/word/2024/wordml/sdtformatlock" xmlns:w16se="http://schemas.microsoft.com/office/word/2015/wordml/symex" xmlns:wpg="http://schemas.microsoft.com/office/word/2010/wordprocessingGroup" xmlns:wpi="http://schemas.microsoft.com/office/word/2010/wordprocessingInk" xmlns:wne="http://schemas.microsoft.com/office/word/2006/wordml" xmlns:wps="http://schemas.microsoft.com/office/word/2010/wordprocessingShape" mc:Ignorable="w14 w15 w16se w16cid w16 w16cex w16sdtdh w16sdtfl w16du wp14">
+<w:numbering xmlns:wpc="http://schemas.microsoft.com/office/word/2010/wordprocessingCanvas" xmlns:cx="http://schemas.microsoft.com/office/drawing/2014/chartex" xmlns:cx1="http://schemas.microsoft.com/office/drawing/2015/9/8/chartex" xmlns:cx2="http://schemas.microsoft.com/office/drawing/2015/10/21/chartex" xmlns:cx3="http://schemas.microsoft.com/office/drawing/2016/5/9/chartex" xmlns:cx4="http://schemas.microsoft.com/office/drawing/2016/5/10/chartex" xmlns:cx5="http://schemas.microsoft.com/office/drawing/2016/5/11/chartex" xmlns:cx6="http://schemas.microsoft.com/office/drawing/2016/5/12/chartex" xmlns:cx7="http://schemas.microsoft.com/office/drawing/2016/5/13/chartex" xmlns:cx8="http://schemas.microsoft.com/office/drawing/2016/5/14/chartex" xmlns:mc="http://schemas.openxmlformats.org/markup-compatibility/2006" xmlns:aink="http://schemas.microsoft.com/office/drawing/2016/ink" xmlns:am3d="http://schemas.microsoft.com/office/drawing/2017/model3d" xmlns:o="urn:schemas-microsoft-com:office:office" xmlns:r="http://schemas.openxmlformats.org/officeDocument/2006/relationships" xmlns:m="http://schemas.openxmlformats.org/officeDocument/2006/math" xmlns:v="urn:schemas-microsoft-com:vml" xmlns:wp14="http://schemas.microsoft.com/office/word/2010/wordprocessingDrawing" xmlns:wp="http://schemas.openxmlformats.org/drawingml/2006/wordprocessingDrawing" xmlns:w10="urn:schemas-microsoft-com:office:word" xmlns:w="http://schemas.openxmlformats.org/wordprocessingml/2006/main" xmlns:w14="http://schemas.microsoft.com/office/word/2010/wordml" xmlns:w15="http://schemas.microsoft.com/office/word/2012/wordml" xmlns:w16cex="http://schemas.microsoft.com/office/word/2018/wordml/cex" xmlns:w16cid="http://schemas.microsoft.com/office/word/2016/wordml/cid" xmlns:w16="http://schemas.microsoft.com/office/word/2018/wordml" xmlns:w16sdtdh="http://schemas.microsoft.com/office/word/2020/wordml/sdtdatahash" xmlns:w16se="http://schemas.microsoft.com/office/word/2015/wordml/symex" xmlns:wpg="http://schemas.microsoft.com/office/word/2010/wordprocessingGroup" xmlns:wpi="http://schemas.microsoft.com/office/word/2010/wordprocessingInk" xmlns:wne="http://schemas.microsoft.com/office/word/2006/wordml" xmlns:wps="http://schemas.microsoft.com/office/word/2010/wordprocessingShape" mc:Ignorable="w14 w15 w16se w16cid w16 w16cex w16sdtdh wp14">
   <w:abstractNum w:abstractNumId="0" w15:restartNumberingAfterBreak="0">
     <w:nsid w:val="0D692DE3"/>
     <w:multiLevelType w:val="multilevel"/>
@@ -20274,52 +21147,52 @@
       </w:rPr>
     </w:lvl>
   </w:abstractNum>
-  <w:num w:numId="1" w16cid:durableId="210313345">
+  <w:num w:numId="1">
     <w:abstractNumId w:val="1"/>
   </w:num>
-  <w:num w:numId="2" w16cid:durableId="884485821">
+  <w:num w:numId="2">
     <w:abstractNumId w:val="5"/>
   </w:num>
-  <w:num w:numId="3" w16cid:durableId="985276781">
+  <w:num w:numId="3">
     <w:abstractNumId w:val="4"/>
   </w:num>
-  <w:num w:numId="4" w16cid:durableId="761730467">
+  <w:num w:numId="4">
     <w:abstractNumId w:val="3"/>
   </w:num>
-  <w:num w:numId="5" w16cid:durableId="1103186976">
+  <w:num w:numId="5">
     <w:abstractNumId w:val="11"/>
   </w:num>
-  <w:num w:numId="6" w16cid:durableId="337006276">
+  <w:num w:numId="6">
     <w:abstractNumId w:val="14"/>
   </w:num>
-  <w:num w:numId="7" w16cid:durableId="389154343">
+  <w:num w:numId="7">
     <w:abstractNumId w:val="15"/>
   </w:num>
-  <w:num w:numId="8" w16cid:durableId="1478182310">
+  <w:num w:numId="8">
     <w:abstractNumId w:val="0"/>
   </w:num>
-  <w:num w:numId="9" w16cid:durableId="902257816">
+  <w:num w:numId="9">
     <w:abstractNumId w:val="9"/>
   </w:num>
-  <w:num w:numId="10" w16cid:durableId="7372559">
+  <w:num w:numId="10">
     <w:abstractNumId w:val="10"/>
   </w:num>
-  <w:num w:numId="11" w16cid:durableId="1530221315">
+  <w:num w:numId="11">
     <w:abstractNumId w:val="2"/>
   </w:num>
-  <w:num w:numId="12" w16cid:durableId="1349329510">
+  <w:num w:numId="12">
     <w:abstractNumId w:val="8"/>
   </w:num>
-  <w:num w:numId="13" w16cid:durableId="1024596324">
+  <w:num w:numId="13">
     <w:abstractNumId w:val="12"/>
   </w:num>
-  <w:num w:numId="14" w16cid:durableId="1811048171">
+  <w:num w:numId="14">
     <w:abstractNumId w:val="7"/>
   </w:num>
-  <w:num w:numId="15" w16cid:durableId="845171344">
+  <w:num w:numId="15">
     <w:abstractNumId w:val="13"/>
   </w:num>
-  <w:num w:numId="16" w16cid:durableId="1634601302">
+  <w:num w:numId="16">
     <w:abstractNumId w:val="6"/>
   </w:num>
   <w:numIdMacAtCleanup w:val="14"/>
@@ -20327,7 +21200,7 @@
 </file>
 
 <file path=word/styles.xml><?xml version="1.0" encoding="utf-8"?>
-<w:styles xmlns:mc="http://schemas.openxmlformats.org/markup-compatibility/2006" xmlns:r="http://schemas.openxmlformats.org/officeDocument/2006/relationships" xmlns:w="http://schemas.openxmlformats.org/wordprocessingml/2006/main" xmlns:w14="http://schemas.microsoft.com/office/word/2010/wordml" xmlns:w15="http://schemas.microsoft.com/office/word/2012/wordml" xmlns:w16cex="http://schemas.microsoft.com/office/word/2018/wordml/cex" xmlns:w16cid="http://schemas.microsoft.com/office/word/2016/wordml/cid" xmlns:w16="http://schemas.microsoft.com/office/word/2018/wordml" xmlns:w16du="http://schemas.microsoft.com/office/word/2023/wordml/word16du" xmlns:w16sdtdh="http://schemas.microsoft.com/office/word/2020/wordml/sdtdatahash" xmlns:w16sdtfl="http://schemas.microsoft.com/office/word/2024/wordml/sdtformatlock" xmlns:w16se="http://schemas.microsoft.com/office/word/2015/wordml/symex" mc:Ignorable="w14 w15 w16se w16cid w16 w16cex w16sdtdh w16sdtfl w16du">
+<w:styles xmlns:mc="http://schemas.openxmlformats.org/markup-compatibility/2006" xmlns:r="http://schemas.openxmlformats.org/officeDocument/2006/relationships" xmlns:w="http://schemas.openxmlformats.org/wordprocessingml/2006/main" xmlns:w14="http://schemas.microsoft.com/office/word/2010/wordml" xmlns:w15="http://schemas.microsoft.com/office/word/2012/wordml" xmlns:w16cex="http://schemas.microsoft.com/office/word/2018/wordml/cex" xmlns:w16cid="http://schemas.microsoft.com/office/word/2016/wordml/cid" xmlns:w16="http://schemas.microsoft.com/office/word/2018/wordml" xmlns:w16sdtdh="http://schemas.microsoft.com/office/word/2020/wordml/sdtdatahash" xmlns:w16se="http://schemas.microsoft.com/office/word/2015/wordml/symex" mc:Ignorable="w14 w15 w16se w16cid w16 w16cex w16sdtdh">
   <w:docDefaults>
     <w:rPrDefault>
       <w:rPr>
@@ -20781,6 +21654,7 @@
   <w:style w:type="character" w:default="1" w:styleId="Fontepargpadro">
     <w:name w:val="Default Paragraph Font"/>
     <w:uiPriority w:val="1"/>
+    <w:semiHidden/>
     <w:unhideWhenUsed/>
   </w:style>
   <w:style w:type="table" w:default="1" w:styleId="Tabelanormal">

</xml_diff>

<commit_message>
fix: Define Node 20 para corrigir erro de build do sharp na Vercel
</commit_message>
<xml_diff>
--- a/tcc/TCC.docx
+++ b/tcc/TCC.docx
@@ -965,7 +965,7 @@
               <w:rPr>
                 <w:webHidden/>
               </w:rPr>
-              <w:t>9</w:t>
+              <w:t>4</w:t>
             </w:r>
             <w:r>
               <w:rPr>
@@ -1054,16 +1054,7 @@
                 <w:noProof/>
                 <w:webHidden/>
               </w:rPr>
-              <w:t>1</w:t>
-            </w:r>
-            <w:r>
-              <w:rPr>
-                <w:b/>
-                <w:bCs/>
-                <w:noProof/>
-                <w:webHidden/>
-              </w:rPr>
-              <w:t>0</w:t>
+              <w:t>5</w:t>
             </w:r>
             <w:r>
               <w:rPr>
@@ -1129,7 +1120,7 @@
               <w:rPr>
                 <w:webHidden/>
               </w:rPr>
-              <w:t>11</w:t>
+              <w:t>6</w:t>
             </w:r>
             <w:r>
               <w:rPr>
@@ -1192,7 +1183,7 @@
               <w:rPr>
                 <w:webHidden/>
               </w:rPr>
-              <w:t>12</w:t>
+              <w:t>7</w:t>
             </w:r>
             <w:r>
               <w:rPr>
@@ -1255,7 +1246,7 @@
               <w:rPr>
                 <w:webHidden/>
               </w:rPr>
-              <w:t>15</w:t>
+              <w:t>10</w:t>
             </w:r>
             <w:r>
               <w:rPr>
@@ -1318,7 +1309,7 @@
               <w:rPr>
                 <w:webHidden/>
               </w:rPr>
-              <w:t>20</w:t>
+              <w:t>15</w:t>
             </w:r>
             <w:r>
               <w:rPr>
@@ -1381,13 +1372,7 @@
               <w:rPr>
                 <w:webHidden/>
               </w:rPr>
-              <w:t>2</w:t>
-            </w:r>
-            <w:r>
-              <w:rPr>
-                <w:webHidden/>
-              </w:rPr>
-              <w:t>3</w:t>
+              <w:t>18</w:t>
             </w:r>
             <w:r>
               <w:rPr>
@@ -1450,7 +1435,7 @@
               <w:rPr>
                 <w:webHidden/>
               </w:rPr>
-              <w:t>25</w:t>
+              <w:t>20</w:t>
             </w:r>
             <w:r>
               <w:rPr>
@@ -1513,7 +1498,7 @@
               <w:rPr>
                 <w:webHidden/>
               </w:rPr>
-              <w:t>26</w:t>
+              <w:t>21</w:t>
             </w:r>
             <w:r>
               <w:rPr>
@@ -1576,7 +1561,7 @@
               <w:rPr>
                 <w:webHidden/>
               </w:rPr>
-              <w:t>27</w:t>
+              <w:t>22</w:t>
             </w:r>
             <w:r>
               <w:rPr>
@@ -1639,7 +1624,7 @@
               <w:rPr>
                 <w:webHidden/>
               </w:rPr>
-              <w:t>29</w:t>
+              <w:t>24</w:t>
             </w:r>
             <w:r>
               <w:rPr>

</xml_diff>